<commit_message>
docs: finalize camera-ready manuscript paper_draft.md, docx, and pdf with Proposed Model naming and embedded 600 DPI figures
</commit_message>
<xml_diff>
--- a/paper_draft.docx
+++ b/paper_draft.docx
@@ -4,187 +4,141 @@
   <w:body>
     <w:p>
       <w:pPr>
-        <w:pStyle w:val="Heading1"/>
-        <w:spacing w:before="240" w:after="120"/>
-        <w:jc w:val="left"/>
+        <w:pStyle w:val="Title"/>
       </w:pPr>
       <w:r>
         <w:t>Dual-Stream Semantic-Frequency Fusion Network for Explainable Deepfake Detection and Cross-Domain Generalization</w:t>
       </w:r>
     </w:p>
     <w:p>
-      <w:pPr>
-        <w:spacing w:after="80" w:line="276" w:lineRule="auto"/>
-      </w:pPr>
       <w:r>
-        <w:t>Shashank Singh Singhania</w:t>
+        <w:t>Shashank Singh Singhania — Department of Computer Science &amp; Engineering — July 2026</w:t>
       </w:r>
     </w:p>
     <w:p>
-      <w:pPr>
-        <w:spacing w:after="80" w:line="276" w:lineRule="auto"/>
-      </w:pPr>
       <w:r>
         <w:t>Department of Computer Science &amp; Engineering</w:t>
       </w:r>
     </w:p>
     <w:p>
-      <w:pPr>
-        <w:spacing w:after="80" w:line="276" w:lineRule="auto"/>
-      </w:pPr>
       <w:r>
         <w:t>July 2026</w:t>
       </w:r>
     </w:p>
     <w:p>
-      <w:pPr>
-        <w:spacing w:after="120"/>
-      </w:pPr>
+      <w:r>
+        <w:t>---</w:t>
+      </w:r>
     </w:p>
     <w:p>
       <w:pPr>
-        <w:pStyle w:val="Heading2"/>
-        <w:spacing w:before="200" w:after="80"/>
-        <w:jc w:val="left"/>
+        <w:pStyle w:val="Heading1"/>
       </w:pPr>
       <w:r>
         <w:t>Abstract</w:t>
       </w:r>
     </w:p>
     <w:p>
-      <w:pPr>
-        <w:spacing w:after="80" w:line="276" w:lineRule="auto"/>
-      </w:pPr>
       <w:r>
-        <w:t>Deepfake generation technologies have evolved rapidly from early autoencoder-based face swaps to modern text-to-image and inpainting diffusion models, posing severe security threats to digital identity and public trust. Existing detection methods often rely on isolated feature domains—such as pure spatial RGB appearance or global frequency spectra—which makes them susceptible to video compression and leads to catastrophic performance collapse when evaluated cross-domain on unseen generative architectures. In this paper, we propose a novel Dual-Stream Semantic-Frequency Fusion Network (Fusion v4) that unifies high-level visual semantic concepts with physics-based high-pass residual noise features for joint binary classification and pixel-level forgery localization. Our architecture integrates a pre-trained CLIP ViT-B/32 Vision-Language Transformer semantic stream with a Spatial Rich Model (SRM) high-pass filter stream backed by a Pretrained EfficientNet-B0 feature extractor with Squeeze-and-Excitation (SE) attention. A dedicated spatial localization head is trained jointly against ground-truth manipulation masks using auxiliary Binary Cross-Entropy loss.</w:t>
+        <w:t>Deepfake generation technologies have evolved rapidly from early autoencoder-based face swaps to modern text-to-image and inpainting diffusion models, posing severe security threats to digital identity and public trust. Existing detection methods often rely on isolated feature domains—such as pure spatial RGB appearance or global frequency spectra—which makes them susceptible to video compression and leads to catastrophic performance collapse when evaluated cross-domain on unseen generative architectures. In this paper, we propose a novel **Dual-Stream Semantic-Frequency Fusion Network (Proposed Model)** that unifies high-level visual semantic concepts with physics-based high-pass residual noise features for joint binary classification and pixel-level forgery localization. Our architecture integrates a pre-trained **CLIP ViT-B/32** Vision-Language Transformer semantic stream with a **Spatial Rich Model (SRM)** high-pass filter stream backed by a **Pretrained EfficientNet-B0** feature extractor with Squeeze-and-Excitation (SE) attention. A dedicated spatial localization head is trained jointly against ground-truth manipulation masks using auxiliary Binary Cross-Entropy loss.</w:t>
+      </w:r>
+    </w:p>
+    <w:p>
+      <w:r>
+        <w:t>Evaluated on the benchmark **FaceForensics++ (FF++) C23** dataset using the official identity-preserved split protocol (159,969 frames across 5,000 videos), our model achieves an overall classification **AUC of 91.07%**, an **Average Precision (AP) of 97.59%**, a **Pointing Game Localization Accuracy of 88.84%**, and an **Adaptive Mask Intersection-over-Union (IoU) of 57.84%**. Furthermore, zero-shot cross-domain evaluation on the **DeepFakeFace (DFF)** dataset—comprising 10,000 images generated via **Stable Diffusion v1.5**, **SD Inpainting**, and **InsightFace**—demonstrates that our model outperforms the standard Xception baseline by **+5.76% overall AUC** (**56.94%** vs. **51.18%**) and by **+8.08% AUC on SD Text2Img fakes** (**52.50%** vs. **44.42%**), proving superior resilience against unseen AI Diffusion generators. Controlled compression experiments demonstrate exceptional robustness, with AUC dropping by **only 0.02%** under heavy JPEG compression ($Q=50$). Comprehensive ablation studies confirm that integrating SE-attention frequency features improves classification AUC by **+3.22%** and localization pointing accuracy by **+13.29%**.</w:t>
+      </w:r>
+    </w:p>
+    <w:p>
+      <w:r>
+        <w:t>*Keywords:* Deepfake Detection, Explainable AI, Vision-Language Transformers, SRM Filters, Zero-Shot Cross-Domain Generalization, Compression Robustness, Spatial Localization, Grad-CAM.</w:t>
+      </w:r>
+    </w:p>
+    <w:p>
+      <w:r>
+        <w:t>---</w:t>
       </w:r>
     </w:p>
     <w:p>
       <w:pPr>
-        <w:spacing w:after="80" w:line="276" w:lineRule="auto"/>
-      </w:pPr>
-      <w:r>
-        <w:t>Evaluated on the benchmark FaceForensics++ (FF++) C23 dataset using the official identity-preserved split protocol (159,969 frames across 5,000 videos), our model achieves an overall classification AUC of 91.07%, an Average Precision (AP) of 97.59%, a Pointing Game Localization Accuracy of 88.84%, and an Adaptive Mask Intersection-over-Union (IoU) of 57.84%. Furthermore, zero-shot cross-domain evaluation on the DeepFakeFace (DFF) dataset—comprising 10,000 images generated via Stable Diffusion v1.5, SD Inpainting, and InsightFace—demonstrates that our model outperforms the standard Xception baseline by +5.76% overall AUC (56.94% vs. 51.18%) and by +8.08% AUC on SD Text2Img fakes (52.50% vs. 44.42%), proving superior resilience against unseen AI Diffusion generators. Controlled compression experiments demonstrate exceptional robustness, with AUC dropping by only 0.02% under heavy JPEG compression ($Q=50$). Comprehensive ablation studies confirm that integrating SE-attention frequency features improves classification AUC by +3.22% and localization pointing accuracy by +13.29%.</w:t>
-      </w:r>
-    </w:p>
-    <w:p>
-      <w:pPr>
-        <w:spacing w:after="80" w:line="276" w:lineRule="auto"/>
-      </w:pPr>
-      <w:r>
-        <w:t>Keywords: Deepfake Detection, Explainable AI, Vision-Language Transformers, SRM Filters, Zero-Shot Cross-Domain Generalization, Compression Robustness, Spatial Localization, Grad-CAM.</w:t>
-      </w:r>
-    </w:p>
-    <w:p>
-      <w:pPr>
-        <w:spacing w:after="120"/>
-      </w:pPr>
-    </w:p>
-    <w:p>
-      <w:pPr>
-        <w:pStyle w:val="Heading2"/>
-        <w:spacing w:before="200" w:after="80"/>
-        <w:jc w:val="left"/>
+        <w:pStyle w:val="Heading1"/>
       </w:pPr>
       <w:r>
         <w:t>I. Introduction</w:t>
       </w:r>
     </w:p>
     <w:p>
-      <w:pPr>
-        <w:spacing w:after="80" w:line="276" w:lineRule="auto"/>
-      </w:pPr>
       <w:r>
         <w:t>The rapid democratization of generative artificial intelligence has rendered synthetic media creation effortless. Modern forgery pipelines range from classic face-swapping algorithms like FaceSwap and Deepfakes to advanced neural rendering techniques such as Face2Face and NeuralTextures, as well as state-of-the-art latent diffusion models like Stable Diffusion. While these advances unlock creative applications in media production, they also enable malicious deepfakes, identity theft, financial fraud, and disinformation campaigns.</w:t>
       </w:r>
     </w:p>
     <w:p>
-      <w:pPr>
-        <w:spacing w:after="80" w:line="276" w:lineRule="auto"/>
-      </w:pPr>
       <w:r>
         <w:t>Early deepfake detectors relied heavily on standard deep convolutional neural networks (CNNs), such as Xception, fine-tuned on specific facial datasets. Although these baseline classifiers achieve exceptional in-distribution accuracy (&gt;98% AUC on clean benchmark splits), recent studies reveal two major structural flaws:</w:t>
       </w:r>
     </w:p>
     <w:p>
-      <w:pPr>
-        <w:spacing w:after="80" w:line="276" w:lineRule="auto"/>
-      </w:pPr>
       <w:r>
-        <w:t>1. Lack of Explainability: Standard classifiers act as uninterpretable "black boxes" that output a single binary probability without providing verifiable spatial evidence indicating where the manipulation occurred.</w:t>
+        <w:t>1. **Lack of Explainability:** Standard classifiers act as uninterpretable "black boxes" that output a single binary probability without providing verifiable spatial evidence indicating *where* the manipulation occurred.</w:t>
       </w:r>
     </w:p>
     <w:p>
-      <w:pPr>
-        <w:spacing w:after="80" w:line="276" w:lineRule="auto"/>
-      </w:pPr>
       <w:r>
-        <w:t>2. Cross-Domain Generalization Collapse: Baseline CNNs over-fit to dataset-specific compression artifacts and background shortcuts. When evaluated zero-shot on unseen generative architectures (e.g., evaluating an FF++ trained model on modern AI Diffusion Models), their classification accuracy collapses to near-random guessing (~50% AUC).</w:t>
+        <w:t>2. **Cross-Domain Generalization Collapse:** Baseline CNNs over-fit to dataset-specific compression artifacts and background shortcuts. When evaluated zero-shot on unseen generative architectures (e.g., evaluating an FF++ trained model on modern AI Diffusion Models), their classification accuracy collapses to near-random guessing (~50% AUC).</w:t>
       </w:r>
     </w:p>
     <w:p>
-      <w:pPr>
-        <w:spacing w:after="80" w:line="276" w:lineRule="auto"/>
-      </w:pPr>
       <w:r>
-        <w:t>To resolve these challenges, we present a Novel Dual-Stream Semantic-Frequency Fusion Network (Fusion v4) designed for simultaneous binary classification, pixel-level spatial explainability, and robust cross-domain generalization. Our primary contributions are summarized as follows:</w:t>
+        <w:t>To resolve these challenges, we present a **Novel Dual-Stream Semantic-Frequency Fusion Network (Proposed Model)** designed for simultaneous binary classification, pixel-level spatial explainability, and robust cross-domain generalization. Our primary contributions are summarized as follows:</w:t>
       </w:r>
     </w:p>
     <w:p>
       <w:pPr>
         <w:pStyle w:val="ListBullet"/>
-        <w:spacing w:after="40"/>
       </w:pPr>
       <w:r>
-        <w:t>Dual-Stream Architecture: We combine a semantic visual stream powered by OpenAI's CLIP ViT-B/32 Vision-Language Transformer (top 2 blocks unfrozen) with a frequency forensic stream utilizing Spatial Rich Model (SRM) noise filters and a pretrained EfficientNet-B0 backbone equipped with Squeeze-and-Excitation attention.</w:t>
+        <w:t>**Dual-Stream Architecture:** We combine a semantic visual stream powered by OpenAI's **CLIP ViT-B/32** Vision-Language Transformer (top 2 blocks unfrozen) with a frequency forensic stream utilizing **Spatial Rich Model (SRM)** noise filters and a pretrained **EfficientNet-B0** backbone equipped with Squeeze-and-Excitation attention.</w:t>
       </w:r>
     </w:p>
     <w:p>
       <w:pPr>
         <w:pStyle w:val="ListBullet"/>
-        <w:spacing w:after="40"/>
       </w:pPr>
       <w:r>
-        <w:t>Adaptive Compression Gating: We introduce a learnable compression gating network that dynamically scales frequency feature maps based on estimated video compression degradation.</w:t>
+        <w:t>**Adaptive Compression Gating:** We introduce a learnable compression gating network that dynamically scales frequency feature maps based on estimated video compression degradation.</w:t>
       </w:r>
     </w:p>
     <w:p>
       <w:pPr>
         <w:pStyle w:val="ListBullet"/>
-        <w:spacing w:after="40"/>
       </w:pPr>
       <w:r>
-        <w:t>Spatial Explainability &amp; Supervision: We incorporate an auxiliary spatial localization head that outputs a 2D forgery heatmap ($224 \times 224$), trained jointly against ground-truth manipulation masks to achieve 88.84% Pointing Game Accuracy and 57.84% Mask IoU.</w:t>
+        <w:t>**Spatial Explainability &amp; Supervision:** We incorporate an auxiliary spatial localization head that outputs a 2D forgery heatmap ($224 \times 224$), trained jointly against ground-truth manipulation masks to achieve **88.84% Pointing Game Accuracy** and **57.84% Mask IoU**.</w:t>
       </w:r>
     </w:p>
     <w:p>
       <w:pPr>
         <w:pStyle w:val="ListBullet"/>
-        <w:spacing w:after="40"/>
       </w:pPr>
       <w:r>
-        <w:t>Zero-Shot Cross-Domain Validation: We perform zero-shot cross-domain evaluation on 10,000 images from the DeepFakeFace (DFF) dataset, proving that our fusion approach significantly outperforms Xception on modern Diffusion Model fakes (+5.76% overall AUC, +8.08% Text2Img AUC).</w:t>
+        <w:t>**Zero-Shot Cross-Domain Validation:** We perform zero-shot cross-domain evaluation on 10,000 images from the **DeepFakeFace (DFF)** dataset, proving that our fusion approach significantly outperforms Xception on modern Diffusion Model fakes (**+5.76% overall AUC**, **+8.08% Text2Img AUC**).</w:t>
       </w:r>
     </w:p>
     <w:p>
       <w:pPr>
         <w:pStyle w:val="ListBullet"/>
-        <w:spacing w:after="40"/>
       </w:pPr>
       <w:r>
-        <w:t>Compression Robustness Evaluation: We evaluate both architectures under controlled JPEG quality degradation ($Q=100$ down to $Q=50$), demonstrating near-zero performance degradation.</w:t>
+        <w:t>**Compression Robustness Evaluation:** We evaluate both architectures under controlled JPEG quality degradation ($Q=100$ down to $Q=50$), demonstrating near-zero performance degradation.</w:t>
+      </w:r>
+    </w:p>
+    <w:p>
+      <w:r>
+        <w:t>---</w:t>
       </w:r>
     </w:p>
     <w:p>
       <w:pPr>
-        <w:spacing w:after="120"/>
-      </w:pPr>
-    </w:p>
-    <w:p>
-      <w:pPr>
-        <w:pStyle w:val="Heading2"/>
-        <w:spacing w:before="200" w:after="80"/>
-        <w:jc w:val="left"/>
+        <w:pStyle w:val="Heading1"/>
       </w:pPr>
       <w:r>
         <w:t>II. Related Work &amp; Literature Survey</w:t>
@@ -192,17 +146,13 @@
     </w:p>
     <w:p>
       <w:pPr>
-        <w:pStyle w:val="Heading3"/>
-        <w:jc w:val="left"/>
+        <w:pStyle w:val="Heading2"/>
       </w:pPr>
       <w:r>
         <w:t>A. Survey of Existing Deepfake Detection Literature</w:t>
       </w:r>
     </w:p>
     <w:p>
-      <w:pPr>
-        <w:spacing w:after="80" w:line="276" w:lineRule="auto"/>
-      </w:pPr>
       <w:r>
         <w:t>We conducted a comprehensive survey of 13 landmark research papers in the deepfake detection domain, summarized in Table I.</w:t>
       </w:r>
@@ -210,862 +160,72 @@
     <w:p>
       <w:pPr>
         <w:pStyle w:val="Heading3"/>
-        <w:jc w:val="left"/>
       </w:pPr>
       <w:r>
         <w:t>TABLE I: Summary of Benchmark Deepfake Detection Literature</w:t>
       </w:r>
     </w:p>
-    <w:tbl>
-      <w:tblPr>
-        <w:tblW w:type="auto" w:w="0"/>
-        <w:jc w:val="center"/>
-        <w:tblLook w:firstColumn="1" w:firstRow="1" w:lastColumn="0" w:lastRow="0" w:noHBand="0" w:noVBand="1" w:val="04A0"/>
-      </w:tblPr>
-      <w:tblGrid>
-        <w:gridCol w:w="1872"/>
-        <w:gridCol w:w="1872"/>
-        <w:gridCol w:w="1872"/>
-        <w:gridCol w:w="1872"/>
-        <w:gridCol w:w="1872"/>
-      </w:tblGrid>
-      <w:tr>
-        <w:tc>
-          <w:tcPr>
-            <w:tcW w:type="dxa" w:w="1872"/>
-          </w:tcPr>
-          <w:p>
-            <w:r>
-              <w:rPr>
-                <w:b/>
-              </w:rPr>
-              <w:t>Paper Title &amp; Authors</w:t>
-            </w:r>
-          </w:p>
-        </w:tc>
-        <w:tc>
-          <w:tcPr>
-            <w:tcW w:type="dxa" w:w="1872"/>
-          </w:tcPr>
-          <w:p>
-            <w:r>
-              <w:rPr>
-                <w:b/>
-              </w:rPr>
-              <w:t>Venue</w:t>
-            </w:r>
-          </w:p>
-        </w:tc>
-        <w:tc>
-          <w:tcPr>
-            <w:tcW w:type="dxa" w:w="1872"/>
-          </w:tcPr>
-          <w:p>
-            <w:r>
-              <w:rPr>
-                <w:b/>
-              </w:rPr>
-              <w:t>Core Methodology</w:t>
-            </w:r>
-          </w:p>
-        </w:tc>
-        <w:tc>
-          <w:tcPr>
-            <w:tcW w:type="dxa" w:w="1872"/>
-          </w:tcPr>
-          <w:p>
-            <w:r>
-              <w:rPr>
-                <w:b/>
-              </w:rPr>
-              <w:t>Key Contribution</w:t>
-            </w:r>
-          </w:p>
-        </w:tc>
-        <w:tc>
-          <w:tcPr>
-            <w:tcW w:type="dxa" w:w="1872"/>
-          </w:tcPr>
-          <w:p>
-            <w:r>
-              <w:rPr>
-                <w:b/>
-              </w:rPr>
-              <w:t>Identified Limitation / Research Gap</w:t>
-            </w:r>
-          </w:p>
-        </w:tc>
-      </w:tr>
-      <w:tr>
-        <w:tc>
-          <w:tcPr>
-            <w:tcW w:type="dxa" w:w="1872"/>
-          </w:tcPr>
-          <w:p>
-            <w:r>
-              <w:t>FaceForensics++ (Rössler et al.)</w:t>
-            </w:r>
-          </w:p>
-        </w:tc>
-        <w:tc>
-          <w:tcPr>
-            <w:tcW w:type="dxa" w:w="1872"/>
-          </w:tcPr>
-          <w:p>
-            <w:r>
-              <w:t>ICCV 2019</w:t>
-            </w:r>
-          </w:p>
-        </w:tc>
-        <w:tc>
-          <w:tcPr>
-            <w:tcW w:type="dxa" w:w="1872"/>
-          </w:tcPr>
-          <w:p>
-            <w:r>
-              <w:t>Standard benchmark dataset &amp; Xception CNN baseline (&gt;99% raw acc).</w:t>
-            </w:r>
-          </w:p>
-        </w:tc>
-        <w:tc>
-          <w:tcPr>
-            <w:tcW w:type="dxa" w:w="1872"/>
-          </w:tcPr>
-          <w:p>
-            <w:r>
-              <w:t>Established standard benchmark protocol and C23 compression protocol.</w:t>
-            </w:r>
-          </w:p>
-        </w:tc>
-        <w:tc>
-          <w:tcPr>
-            <w:tcW w:type="dxa" w:w="1872"/>
-          </w:tcPr>
-          <w:p>
-            <w:r>
-              <w:t>Did not test cross-dataset generalization or modern diffusion fakes.</w:t>
-            </w:r>
-          </w:p>
-        </w:tc>
-      </w:tr>
-      <w:tr>
-        <w:tc>
-          <w:tcPr>
-            <w:tcW w:type="dxa" w:w="1872"/>
-          </w:tcPr>
-          <w:p>
-            <w:r>
-              <w:t>Face X-ray (Li et al.)</w:t>
-            </w:r>
-          </w:p>
-        </w:tc>
-        <w:tc>
-          <w:tcPr>
-            <w:tcW w:type="dxa" w:w="1872"/>
-          </w:tcPr>
-          <w:p>
-            <w:r>
-              <w:t>CVPR 2020</w:t>
-            </w:r>
-          </w:p>
-        </w:tc>
-        <w:tc>
-          <w:tcPr>
-            <w:tcW w:type="dxa" w:w="1872"/>
-          </w:tcPr>
-          <w:p>
-            <w:r>
-              <w:t>Detects image blending boundaries rather than specific GAN artifacts.</w:t>
-            </w:r>
-          </w:p>
-        </w:tc>
-        <w:tc>
-          <w:tcPr>
-            <w:tcW w:type="dxa" w:w="1872"/>
-          </w:tcPr>
-          <w:p>
-            <w:r>
-              <w:t>Shifted focus toward universal face blending boundaries.</w:t>
-            </w:r>
-          </w:p>
-        </w:tc>
-        <w:tc>
-          <w:tcPr>
-            <w:tcW w:type="dxa" w:w="1872"/>
-          </w:tcPr>
-          <w:p>
-            <w:r>
-              <w:t>Fails when no blending boundary exists (e.g. text-to-image diffusion).</w:t>
-            </w:r>
-          </w:p>
-        </w:tc>
-      </w:tr>
-      <w:tr>
-        <w:tc>
-          <w:tcPr>
-            <w:tcW w:type="dxa" w:w="1872"/>
-          </w:tcPr>
-          <w:p>
-            <w:r>
-              <w:t>Multi-attentional (Zhao et al.)</w:t>
-            </w:r>
-          </w:p>
-        </w:tc>
-        <w:tc>
-          <w:tcPr>
-            <w:tcW w:type="dxa" w:w="1872"/>
-          </w:tcPr>
-          <w:p>
-            <w:r>
-              <w:t>CVPR 2021</w:t>
-            </w:r>
-          </w:p>
-        </w:tc>
-        <w:tc>
-          <w:tcPr>
-            <w:tcW w:type="dxa" w:w="1872"/>
-          </w:tcPr>
-          <w:p>
-            <w:r>
-              <w:t>Multi-head spatial attention zooming into eyes, mouth, and skin textures.</w:t>
-            </w:r>
-          </w:p>
-        </w:tc>
-        <w:tc>
-          <w:tcPr>
-            <w:tcW w:type="dxa" w:w="1872"/>
-          </w:tcPr>
-          <w:p>
-            <w:r>
-              <w:t>Improved detection of subtle local manipulations (NeuralTextures).</w:t>
-            </w:r>
-          </w:p>
-        </w:tc>
-        <w:tc>
-          <w:tcPr>
-            <w:tcW w:type="dxa" w:w="1872"/>
-          </w:tcPr>
-          <w:p>
-            <w:r>
-              <w:t>Attention maps were never quantitatively evaluated against GT masks.</w:t>
-            </w:r>
-          </w:p>
-        </w:tc>
-      </w:tr>
-      <w:tr>
-        <w:tc>
-          <w:tcPr>
-            <w:tcW w:type="dxa" w:w="1872"/>
-          </w:tcPr>
-          <w:p>
-            <w:r>
-              <w:t>PCL (Li et al.)</w:t>
-            </w:r>
-          </w:p>
-        </w:tc>
-        <w:tc>
-          <w:tcPr>
-            <w:tcW w:type="dxa" w:w="1872"/>
-          </w:tcPr>
-          <w:p>
-            <w:r>
-              <w:t>CVPR 2021</w:t>
-            </w:r>
-          </w:p>
-        </w:tc>
-        <w:tc>
-          <w:tcPr>
-            <w:tcW w:type="dxa" w:w="1872"/>
-          </w:tcPr>
-          <w:p>
-            <w:r>
-              <w:t>Pairwise self-consistency checking feature agreement across facial parts.</w:t>
-            </w:r>
-          </w:p>
-        </w:tc>
-        <w:tc>
-          <w:tcPr>
-            <w:tcW w:type="dxa" w:w="1872"/>
-          </w:tcPr>
-          <w:p>
-            <w:r>
-              <w:t>Consistency signals detect forgeries without explicit fake labels.</w:t>
-            </w:r>
-          </w:p>
-        </w:tc>
-        <w:tc>
-          <w:tcPr>
-            <w:tcW w:type="dxa" w:w="1872"/>
-          </w:tcPr>
-          <w:p>
-            <w:r>
-              <w:t>Breaks down under heavy video compression (C23/C40).</w:t>
-            </w:r>
-          </w:p>
-        </w:tc>
-      </w:tr>
-      <w:tr>
-        <w:tc>
-          <w:tcPr>
-            <w:tcW w:type="dxa" w:w="1872"/>
-          </w:tcPr>
-          <w:p>
-            <w:r>
-              <w:t>High-Freq SRM (Luo et al.)</w:t>
-            </w:r>
-          </w:p>
-        </w:tc>
-        <w:tc>
-          <w:tcPr>
-            <w:tcW w:type="dxa" w:w="1872"/>
-          </w:tcPr>
-          <w:p>
-            <w:r>
-              <w:t>CVPR 2021</w:t>
-            </w:r>
-          </w:p>
-        </w:tc>
-        <w:tc>
-          <w:tcPr>
-            <w:tcW w:type="dxa" w:w="1872"/>
-          </w:tcPr>
-          <w:p>
-            <w:r>
-              <w:t>Spatial Rich Model (SRM) high-pass noise filters extracting noise artifacts.</w:t>
-            </w:r>
-          </w:p>
-        </w:tc>
-        <w:tc>
-          <w:tcPr>
-            <w:tcW w:type="dxa" w:w="1872"/>
-          </w:tcPr>
-          <w:p>
-            <w:r>
-              <w:t>Showed high-frequency noise exposes hidden mathematical GAN traces.</w:t>
-            </w:r>
-          </w:p>
-        </w:tc>
-        <w:tc>
-          <w:tcPr>
-            <w:tcW w:type="dxa" w:w="1872"/>
-          </w:tcPr>
-          <w:p>
-            <w:r>
-              <w:t>High-frequency details are easily degraded by video re-encoding.</w:t>
-            </w:r>
-          </w:p>
-        </w:tc>
-      </w:tr>
-      <w:tr>
-        <w:tc>
-          <w:tcPr>
-            <w:tcW w:type="dxa" w:w="1872"/>
-          </w:tcPr>
-          <w:p>
-            <w:r>
-              <w:t>Self-Blended Images (SBI) (Shiohara et al.)</w:t>
-            </w:r>
-          </w:p>
-        </w:tc>
-        <w:tc>
-          <w:tcPr>
-            <w:tcW w:type="dxa" w:w="1872"/>
-          </w:tcPr>
-          <w:p>
-            <w:r>
-              <w:t>CVPR 2022</w:t>
-            </w:r>
-          </w:p>
-        </w:tc>
-        <w:tc>
-          <w:tcPr>
-            <w:tcW w:type="dxa" w:w="1872"/>
-          </w:tcPr>
-          <w:p>
-            <w:r>
-              <w:t>Synthetic self-blending creating fake training pairs without fake datasets.</w:t>
-            </w:r>
-          </w:p>
-        </w:tc>
-        <w:tc>
-          <w:tcPr>
-            <w:tcW w:type="dxa" w:w="1872"/>
-          </w:tcPr>
-          <w:p>
-            <w:r>
-              <w:t>Achieved &gt;90% cross-dataset accuracy on Celeb-DF without fake training data.</w:t>
-            </w:r>
-          </w:p>
-        </w:tc>
-        <w:tc>
-          <w:tcPr>
-            <w:tcW w:type="dxa" w:w="1872"/>
-          </w:tcPr>
-          <w:p>
-            <w:r>
-              <w:t>Landmark failure on extreme angles; poor in-dataset performance without tuning.</w:t>
-            </w:r>
-          </w:p>
-        </w:tc>
-      </w:tr>
-      <w:tr>
-        <w:tc>
-          <w:tcPr>
-            <w:tcW w:type="dxa" w:w="1872"/>
-          </w:tcPr>
-          <w:p>
-            <w:r>
-              <w:t>SLADD (Chen et al.)</w:t>
-            </w:r>
-          </w:p>
-        </w:tc>
-        <w:tc>
-          <w:tcPr>
-            <w:tcW w:type="dxa" w:w="1872"/>
-          </w:tcPr>
-          <w:p>
-            <w:r>
-              <w:t>CVPR 2022</w:t>
-            </w:r>
-          </w:p>
-        </w:tc>
-        <w:tc>
-          <w:tcPr>
-            <w:tcW w:type="dxa" w:w="1872"/>
-          </w:tcPr>
-          <w:p>
-            <w:r>
-              <w:t>Adversarial learning discovering hard fake image augmentations dynamically.</w:t>
-            </w:r>
-          </w:p>
-        </w:tc>
-        <w:tc>
-          <w:tcPr>
-            <w:tcW w:type="dxa" w:w="1872"/>
-          </w:tcPr>
-          <w:p>
-            <w:r>
-              <w:t>Dynamically adapts training data to prevent over-fitting.</w:t>
-            </w:r>
-          </w:p>
-        </w:tc>
-        <w:tc>
-          <w:tcPr>
-            <w:tcW w:type="dxa" w:w="1872"/>
-          </w:tcPr>
-          <w:p>
-            <w:r>
-              <w:t>Increases training complexity; unverified on diffusion fakes.</w:t>
-            </w:r>
-          </w:p>
-        </w:tc>
-      </w:tr>
-      <w:tr>
-        <w:tc>
-          <w:tcPr>
-            <w:tcW w:type="dxa" w:w="1872"/>
-          </w:tcPr>
-          <w:p>
-            <w:r>
-              <w:t>UIA-ViT (Zhuang et al.)</w:t>
-            </w:r>
-          </w:p>
-        </w:tc>
-        <w:tc>
-          <w:tcPr>
-            <w:tcW w:type="dxa" w:w="1872"/>
-          </w:tcPr>
-          <w:p>
-            <w:r>
-              <w:t>ECCV 2022</w:t>
-            </w:r>
-          </w:p>
-        </w:tc>
-        <w:tc>
-          <w:tcPr>
-            <w:tcW w:type="dxa" w:w="1872"/>
-          </w:tcPr>
-          <w:p>
-            <w:r>
-              <w:t>Vision Transformer (ViT) patch-consistency loss highlighting fake patches.</w:t>
-            </w:r>
-          </w:p>
-        </w:tc>
-        <w:tc>
-          <w:tcPr>
-            <w:tcW w:type="dxa" w:w="1872"/>
-          </w:tcPr>
-          <w:p>
-            <w:r>
-              <w:t>Showed Transformers learn forgery boundaries without pixel masks.</w:t>
-            </w:r>
-          </w:p>
-        </w:tc>
-        <w:tc>
-          <w:tcPr>
-            <w:tcW w:type="dxa" w:w="1872"/>
-          </w:tcPr>
-          <w:p>
-            <w:r>
-              <w:t>Compute-heavy; attention maps were only visually inspected.</w:t>
-            </w:r>
-          </w:p>
-        </w:tc>
-      </w:tr>
-      <w:tr>
-        <w:tc>
-          <w:tcPr>
-            <w:tcW w:type="dxa" w:w="1872"/>
-          </w:tcPr>
-          <w:p>
-            <w:r>
-              <w:t>AltFreezing (Wang et al.)</w:t>
-            </w:r>
-          </w:p>
-        </w:tc>
-        <w:tc>
-          <w:tcPr>
-            <w:tcW w:type="dxa" w:w="1872"/>
-          </w:tcPr>
-          <w:p>
-            <w:r>
-              <w:t>CVPR 2023</w:t>
-            </w:r>
-          </w:p>
-        </w:tc>
-        <w:tc>
-          <w:tcPr>
-            <w:tcW w:type="dxa" w:w="1872"/>
-          </w:tcPr>
-          <w:p>
-            <w:r>
-              <w:t>3D-CNN alternating spatial and temporal freezing during training.</w:t>
-            </w:r>
-          </w:p>
-        </w:tc>
-        <w:tc>
-          <w:tcPr>
-            <w:tcW w:type="dxa" w:w="1872"/>
-          </w:tcPr>
-          <w:p>
-            <w:r>
-              <w:t>Forced network to learn spatial artifacts and temporal motion glitches.</w:t>
-            </w:r>
-          </w:p>
-        </w:tc>
-        <w:tc>
-          <w:tcPr>
-            <w:tcW w:type="dxa" w:w="1872"/>
-          </w:tcPr>
-          <w:p>
-            <w:r>
-              <w:t>Slow compute; clip-level rather than fine-grained per-frame spatial masks.</w:t>
-            </w:r>
-          </w:p>
-        </w:tc>
-      </w:tr>
-      <w:tr>
-        <w:tc>
-          <w:tcPr>
-            <w:tcW w:type="dxa" w:w="1872"/>
-          </w:tcPr>
-          <w:p>
-            <w:r>
-              <w:t>TALL (Xu et al.)</w:t>
-            </w:r>
-          </w:p>
-        </w:tc>
-        <w:tc>
-          <w:tcPr>
-            <w:tcW w:type="dxa" w:w="1872"/>
-          </w:tcPr>
-          <w:p>
-            <w:r>
-              <w:t>CVPR 2023</w:t>
-            </w:r>
-          </w:p>
-        </w:tc>
-        <w:tc>
-          <w:tcPr>
-            <w:tcW w:type="dxa" w:w="1872"/>
-          </w:tcPr>
-          <w:p>
-            <w:r>
-              <w:t>2D thumbnail grid layouts allowing 2D Swin-Transformers to process video.</w:t>
-            </w:r>
-          </w:p>
-        </w:tc>
-        <w:tc>
-          <w:tcPr>
-            <w:tcW w:type="dxa" w:w="1872"/>
-          </w:tcPr>
-          <w:p>
-            <w:r>
-              <w:t>High efficiency for video deepfake detection compared to 3D-CNNs.</w:t>
-            </w:r>
-          </w:p>
-        </w:tc>
-        <w:tc>
-          <w:tcPr>
-            <w:tcW w:type="dxa" w:w="1872"/>
-          </w:tcPr>
-          <w:p>
-            <w:r>
-              <w:t>Thumbnail layout destroys fine spatial details needed for mask localization.</w:t>
-            </w:r>
-          </w:p>
-        </w:tc>
-      </w:tr>
-      <w:tr>
-        <w:tc>
-          <w:tcPr>
-            <w:tcW w:type="dxa" w:w="1872"/>
-          </w:tcPr>
-          <w:p>
-            <w:r>
-              <w:t>Implicit Identity Leakage (Dong et al.)</w:t>
-            </w:r>
-          </w:p>
-        </w:tc>
-        <w:tc>
-          <w:tcPr>
-            <w:tcW w:type="dxa" w:w="1872"/>
-          </w:tcPr>
-          <w:p>
-            <w:r>
-              <w:t>CVPR 2023</w:t>
-            </w:r>
-          </w:p>
-        </w:tc>
-        <w:tc>
-          <w:tcPr>
-            <w:tcW w:type="dxa" w:w="1872"/>
-          </w:tcPr>
-          <w:p>
-            <w:r>
-              <w:t>Proved detectors cheat by memorizing subject identity instead of fakes.</w:t>
-            </w:r>
-          </w:p>
-        </w:tc>
-        <w:tc>
-          <w:tcPr>
-            <w:tcW w:type="dxa" w:w="1872"/>
-          </w:tcPr>
-          <w:p>
-            <w:r>
-              <w:t>Proposed identity-disentanglement to force model to ignore subject identity.</w:t>
-            </w:r>
-          </w:p>
-        </w:tc>
-        <w:tc>
-          <w:tcPr>
-            <w:tcW w:type="dxa" w:w="1872"/>
-          </w:tcPr>
-          <w:p>
-            <w:r>
-              <w:t>Adds complex multi-task loss terms without full identity disentanglement.</w:t>
-            </w:r>
-          </w:p>
-        </w:tc>
-      </w:tr>
-      <w:tr>
-        <w:tc>
-          <w:tcPr>
-            <w:tcW w:type="dxa" w:w="1872"/>
-          </w:tcPr>
-          <w:p>
-            <w:r>
-              <w:t>UCF (Yan et al.)</w:t>
-            </w:r>
-          </w:p>
-        </w:tc>
-        <w:tc>
-          <w:tcPr>
-            <w:tcW w:type="dxa" w:w="1872"/>
-          </w:tcPr>
-          <w:p>
-            <w:r>
-              <w:t>CVPR 2023</w:t>
-            </w:r>
-          </w:p>
-        </w:tc>
-        <w:tc>
-          <w:tcPr>
-            <w:tcW w:type="dxa" w:w="1872"/>
-          </w:tcPr>
-          <w:p>
-            <w:r>
-              <w:t>Separated identity/content features from universal forgery features.</w:t>
-            </w:r>
-          </w:p>
-        </w:tc>
-        <w:tc>
-          <w:tcPr>
-            <w:tcW w:type="dxa" w:w="1872"/>
-          </w:tcPr>
-          <w:p>
-            <w:r>
-              <w:t>Strong generalization across different deepfake generation methods.</w:t>
-            </w:r>
-          </w:p>
-        </w:tc>
-        <w:tc>
-          <w:tcPr>
-            <w:tcW w:type="dxa" w:w="1872"/>
-          </w:tcPr>
-          <w:p>
-            <w:r>
-              <w:t>Complex disentanglement; tested primarily on older GANs.</w:t>
-            </w:r>
-          </w:p>
-        </w:tc>
-      </w:tr>
-      <w:tr>
-        <w:tc>
-          <w:tcPr>
-            <w:tcW w:type="dxa" w:w="1872"/>
-          </w:tcPr>
-          <w:p>
-            <w:r>
-              <w:t>DeepFakeFace (DFF) (Song et al.)</w:t>
-            </w:r>
-          </w:p>
-        </w:tc>
-        <w:tc>
-          <w:tcPr>
-            <w:tcW w:type="dxa" w:w="1872"/>
-          </w:tcPr>
-          <w:p>
-            <w:r>
-              <w:t>HF 2023</w:t>
-            </w:r>
-          </w:p>
-        </w:tc>
-        <w:tc>
-          <w:tcPr>
-            <w:tcW w:type="dxa" w:w="1872"/>
-          </w:tcPr>
-          <w:p>
-            <w:r>
-              <w:t>Diffusion Model dataset testing generalizability against text2img &amp; inpainting.</w:t>
-            </w:r>
-          </w:p>
-        </w:tc>
-        <w:tc>
-          <w:tcPr>
-            <w:tcW w:type="dxa" w:w="1872"/>
-          </w:tcPr>
-          <w:p>
-            <w:r>
-              <w:t>Proved traditional detectors fail dramatically on diffusion fakes.</w:t>
-            </w:r>
-          </w:p>
-        </w:tc>
-        <w:tc>
-          <w:tcPr>
-            <w:tcW w:type="dxa" w:w="1872"/>
-          </w:tcPr>
-          <w:p>
-            <w:r>
-              <w:t>Focuses on dataset creation rather than spatial localization architectures.</w:t>
-            </w:r>
-          </w:p>
-        </w:tc>
-      </w:tr>
-    </w:tbl>
     <w:p>
-      <w:pPr>
-        <w:spacing w:after="120"/>
-      </w:pPr>
+      <w:r>
+        <w:t>---</w:t>
+      </w:r>
     </w:p>
     <w:p>
       <w:pPr>
-        <w:spacing w:after="120"/>
-      </w:pPr>
-    </w:p>
-    <w:p>
-      <w:pPr>
-        <w:pStyle w:val="Heading3"/>
-        <w:jc w:val="left"/>
+        <w:pStyle w:val="Heading2"/>
       </w:pPr>
       <w:r>
         <w:t>B. The 7 Identified Literature Gaps</w:t>
       </w:r>
     </w:p>
     <w:p>
-      <w:pPr>
-        <w:spacing w:after="80" w:line="276" w:lineRule="auto"/>
-      </w:pPr>
       <w:r>
         <w:t>Based on our survey, we identified 7 major literature gaps in existing deepfake detection systems:</w:t>
       </w:r>
     </w:p>
     <w:p>
-      <w:pPr>
-        <w:spacing w:after="80" w:line="276" w:lineRule="auto"/>
-      </w:pPr>
       <w:r>
-        <w:t>1. Compression Sensitivity: Standard CNNs collapse when videos undergo H.264 compression (C23/C40).</w:t>
+        <w:t>1. **Compression Sensitivity:** Standard CNNs collapse when videos undergo H.264 compression (C23/C40).</w:t>
+      </w:r>
+    </w:p>
+    <w:p>
+      <w:r>
+        <w:t>2. **Generator Over-fitting:** Models trained on 2019 GAN algorithms fail when tested on modern AI Diffusion Models.</w:t>
+      </w:r>
+    </w:p>
+    <w:p>
+      <w:r>
+        <w:t>3. **Lack of Quantitative Explainability:** Papers present visual Grad-CAM figures but omit quantitative metrics (Pointing Game Accuracy, Mask IoU).</w:t>
+      </w:r>
+    </w:p>
+    <w:p>
+      <w:r>
+        <w:t>4. **Isolated Feature Streams:** Architectures focus exclusively on RGB appearance *or* frequency noise, missing cross-domain synergy.</w:t>
+      </w:r>
+    </w:p>
+    <w:p>
+      <w:r>
+        <w:t>5. **Identity Memorization:** Classifiers memorize human faces rather than learning universal forgery artifacts.</w:t>
+      </w:r>
+    </w:p>
+    <w:p>
+      <w:r>
+        <w:t>6. **Parameter Inefficiency:** Transformer-based solutions require massive compute and full parameter fine-tuning.</w:t>
+      </w:r>
+    </w:p>
+    <w:p>
+      <w:r>
+        <w:t>7. **Real-World Generalization Gap:** High in-distribution scores (&gt;99%) drop to random guessing (~50%) on wild internet media.</w:t>
+      </w:r>
+    </w:p>
+    <w:p>
+      <w:r>
+        <w:t>---</w:t>
       </w:r>
     </w:p>
     <w:p>
       <w:pPr>
-        <w:spacing w:after="80" w:line="276" w:lineRule="auto"/>
-      </w:pPr>
-      <w:r>
-        <w:t>2. Generator Over-fitting: Models trained on 2019 GAN algorithms fail when tested on modern AI Diffusion Models.</w:t>
-      </w:r>
-    </w:p>
-    <w:p>
-      <w:pPr>
-        <w:spacing w:after="80" w:line="276" w:lineRule="auto"/>
-      </w:pPr>
-      <w:r>
-        <w:t>3. Lack of Quantitative Explainability: Papers present visual Grad-CAM figures but omit quantitative metrics (Pointing Game Accuracy, Mask IoU).</w:t>
-      </w:r>
-    </w:p>
-    <w:p>
-      <w:pPr>
-        <w:spacing w:after="80" w:line="276" w:lineRule="auto"/>
-      </w:pPr>
-      <w:r>
-        <w:t>4. Isolated Feature Streams: Architectures focus exclusively on RGB appearance or frequency noise, missing cross-domain synergy.</w:t>
-      </w:r>
-    </w:p>
-    <w:p>
-      <w:pPr>
-        <w:spacing w:after="80" w:line="276" w:lineRule="auto"/>
-      </w:pPr>
-      <w:r>
-        <w:t>5. Identity Memorization: Classifiers memorize human faces rather than learning universal forgery artifacts.</w:t>
-      </w:r>
-    </w:p>
-    <w:p>
-      <w:pPr>
-        <w:spacing w:after="80" w:line="276" w:lineRule="auto"/>
-      </w:pPr>
-      <w:r>
-        <w:t>6. Parameter Inefficiency: Transformer-based solutions require massive compute and full parameter fine-tuning.</w:t>
-      </w:r>
-    </w:p>
-    <w:p>
-      <w:pPr>
-        <w:spacing w:after="80" w:line="276" w:lineRule="auto"/>
-      </w:pPr>
-      <w:r>
-        <w:t>7. Real-World Generalization Gap: High in-distribution scores (&gt;99%) drop to random guessing (~50%) on wild internet media.</w:t>
-      </w:r>
-    </w:p>
-    <w:p>
-      <w:pPr>
-        <w:spacing w:after="120"/>
-      </w:pPr>
-    </w:p>
-    <w:p>
-      <w:pPr>
-        <w:pStyle w:val="Heading2"/>
-        <w:spacing w:before="200" w:after="80"/>
-        <w:jc w:val="left"/>
+        <w:pStyle w:val="Heading1"/>
       </w:pPr>
       <w:r>
         <w:t>III. Proposed Methodology</w:t>
@@ -1073,279 +233,167 @@
     </w:p>
     <w:p>
       <w:pPr>
-        <w:pStyle w:val="Heading3"/>
-        <w:jc w:val="left"/>
+        <w:pStyle w:val="Heading2"/>
       </w:pPr>
       <w:r>
         <w:t>A. Overall Network Architecture</w:t>
       </w:r>
     </w:p>
     <w:p>
-      <w:pPr>
-        <w:spacing w:after="80" w:line="276" w:lineRule="auto"/>
-      </w:pPr>
       <w:r>
-        <w:t>Our Dual-Stream Fusion Model v4 processes an input face crop $X \in \mathbb{R}^{3 \times H \times W}$ ($H=W=224$) through two parallel feature extraction streams, as illustrated in Fig. 1.</w:t>
+        <w:t>Our **Proposed Dual-Stream Fusion Network** processes an input face crop $X \in \mathbb{R}^{3 \times H \times W}$ ($H=W=224$) through two parallel feature extraction streams, as illustrated in Fig. 1.</w:t>
+      </w:r>
+    </w:p>
+    <w:p>
+      <w:r>
+        <w:t>*Fig. 1. Complete architectural layout of the Proposed Dual-Stream Semantic-Frequency Fusion Network.*</w:t>
+      </w:r>
+    </w:p>
+    <w:p>
+      <w:r>
+        <w:t>---</w:t>
       </w:r>
     </w:p>
     <w:p>
       <w:pPr>
-        <w:spacing w:after="120"/>
-      </w:pPr>
-      <w:r>
-        <w:t xml:space="preserve">                           Input Face Crop (224 x 224 x 3)</w:t>
-        <w:br/>
-        <w:t xml:space="preserve">                                          │</w:t>
-        <w:br/>
-        <w:t xml:space="preserve">                   ┌──────────────────────┴──────────────────────┐</w:t>
-        <w:br/>
-        <w:t xml:space="preserve">                   ▼                                             ▼</w:t>
-        <w:br/>
-        <w:t xml:space="preserve">        Stream 1: Semantic Branch                     Stream 2: Frequency Branch</w:t>
-        <w:br/>
-        <w:t xml:space="preserve">     (CLIP ViT-B/32 - Top 2 Unfrozen)             (3 SRM Filters + EfficientNet-B0)</w:t>
-        <w:br/>
-        <w:t xml:space="preserve">                   │                                             │</w:t>
-        <w:br/>
-        <w:t xml:space="preserve">             256-dim Vector                              128x28x28 Feature Map</w:t>
-        <w:br/>
-        <w:t xml:space="preserve">                   │                                             │</w:t>
-        <w:br/>
-        <w:t xml:space="preserve">                   └──────────────────────┬──────────────────────┘</w:t>
-        <w:br/>
-        <w:t xml:space="preserve">                                          ▼</w:t>
-        <w:br/>
-        <w:t xml:space="preserve">                             Compression Gate &amp; Pooling</w:t>
-        <w:br/>
-        <w:t xml:space="preserve">                                          │</w:t>
-        <w:br/>
-        <w:t xml:space="preserve">                                   284-dim Vector</w:t>
-        <w:br/>
-        <w:t xml:space="preserve">                                          │</w:t>
-        <w:br/>
-        <w:t xml:space="preserve">                   ┌──────────────────────┴──────────────────────┐</w:t>
-        <w:br/>
-        <w:t xml:space="preserve">                   ▼                                             ▼</w:t>
-        <w:br/>
-        <w:t xml:space="preserve">       Classification Output Head                    Localization / Explainability Head</w:t>
-        <w:br/>
-        <w:t xml:space="preserve">   Predicts overall REAL vs FAKE score              Outputs a 2D spatial heatmap drawing a</w:t>
-        <w:br/>
-        <w:t xml:space="preserve">            (Single Logit / AUC)                   highlighter over the exact fake region</w:t>
-        <w:br/>
-        <w:t xml:space="preserve">                                                  (Supervised by ground-truth masks)</w:t>
-      </w:r>
-    </w:p>
-    <w:p>
-      <w:pPr>
-        <w:spacing w:after="80" w:line="276" w:lineRule="auto"/>
-      </w:pPr>
-      <w:r>
-        <w:t>Fig. 1. Complete architectural layout of the Dual-Stream Semantic-Frequency Fusion Model v4.</w:t>
-      </w:r>
-    </w:p>
-    <w:p>
-      <w:pPr>
-        <w:spacing w:after="120"/>
-      </w:pPr>
-    </w:p>
-    <w:p>
-      <w:pPr>
-        <w:pStyle w:val="Heading3"/>
-        <w:jc w:val="left"/>
+        <w:pStyle w:val="Heading2"/>
       </w:pPr>
       <w:r>
         <w:t>B. Stream 1: Semantic Visual Branch (CLIP ViT-B/32)</w:t>
       </w:r>
     </w:p>
     <w:p>
-      <w:pPr>
-        <w:spacing w:after="80" w:line="276" w:lineRule="auto"/>
-      </w:pPr>
       <w:r>
-        <w:t>Stream 1 extracts high-level visual semantic concepts, facial symmetry, and structural anomalies using OpenAI's pre-trained CLIP ViT-B/32 Vision-Language Transformer. To preserve pre-trained general representations while adapting to deepfake artifacts, we freeze the bottom 10 Vision Transformer blocks and unfreeze only the top 2 blocks:</w:t>
+        <w:t>Stream 1 extracts high-level visual semantic concepts, facial symmetry, and structural anomalies using OpenAI's pre-trained **CLIP ViT-B/32** Vision-Language Transformer. To preserve pre-trained general representations while adapting to deepfake artifacts, we freeze the bottom 10 Vision Transformer blocks and unfreeze only the top 2 blocks:</w:t>
       </w:r>
     </w:p>
     <w:p>
-      <w:pPr>
-        <w:spacing w:after="80" w:line="276" w:lineRule="auto"/>
-      </w:pPr>
       <w:r>
         <w:t>$$f_{\text{semantic}} = \text{Linear}_{512 \to 256}\left(\text{CLIP}_{\text{top2}}(X)\right) \in \mathbb{R}^{256}$$</w:t>
       </w:r>
     </w:p>
     <w:p>
-      <w:pPr>
-        <w:spacing w:after="120"/>
-      </w:pPr>
+      <w:r>
+        <w:t>---</w:t>
+      </w:r>
     </w:p>
     <w:p>
       <w:pPr>
-        <w:pStyle w:val="Heading3"/>
-        <w:jc w:val="left"/>
+        <w:pStyle w:val="Heading2"/>
       </w:pPr>
       <w:r>
         <w:t>C. Stream 2: Frequency Forensic Branch (SRM + EfficientNet-B0)</w:t>
       </w:r>
     </w:p>
     <w:p>
-      <w:pPr>
-        <w:spacing w:after="80" w:line="276" w:lineRule="auto"/>
-      </w:pPr>
       <w:r>
         <w:t>Stream 2 isolates mathematical high-frequency noise residuals left by AI face-swappers. The RGB input is converted to grayscale $I_{\text{gray}} \in \mathbb{R}^{1 \times H \times W}$ and filtered through 3 fixed $5 \times 5$ Spatial Rich Model (SRM) high-pass kernels $K_1, K_2, K_3$:</w:t>
       </w:r>
     </w:p>
     <w:p>
-      <w:pPr>
-        <w:spacing w:after="80" w:line="276" w:lineRule="auto"/>
-      </w:pPr>
       <w:r>
         <w:t>$$R_c = K_c * I_{\text{gray}}, \quad c \in \{1, 2, 3\}$$</w:t>
       </w:r>
     </w:p>
     <w:p>
-      <w:pPr>
-        <w:spacing w:after="80" w:line="276" w:lineRule="auto"/>
-      </w:pPr>
       <w:r>
-        <w:t>The resulting 3-channel noise residual map $R \in \mathbb{R}^{3 \times H \times W}$ is fed into a pre-trained EfficientNet-B0 backbone equipped with Squeeze-and-Excitation (SE) attention blocks:</w:t>
+        <w:t>The resulting 3-channel noise residual map $R \in \mathbb{R}^{3 \times H \times W}$ is fed into a pre-trained **EfficientNet-B0** backbone equipped with Squeeze-and-Excitation (SE) attention blocks:</w:t>
       </w:r>
     </w:p>
     <w:p>
-      <w:pPr>
-        <w:spacing w:after="80" w:line="276" w:lineRule="auto"/>
-      </w:pPr>
       <w:r>
         <w:t>$$F_{\text{spatial}} = \text{Conv}_{1\times1}\left(\text{EfficientNet-B0}_{\text{Stage2}}(R)\right) \in \mathbb{R}^{128 \times 28 \times 28}$$</w:t>
       </w:r>
     </w:p>
     <w:p>
-      <w:pPr>
-        <w:spacing w:after="120"/>
-      </w:pPr>
+      <w:r>
+        <w:t>---</w:t>
+      </w:r>
     </w:p>
     <w:p>
       <w:pPr>
-        <w:pStyle w:val="Heading3"/>
-        <w:jc w:val="left"/>
+        <w:pStyle w:val="Heading2"/>
       </w:pPr>
       <w:r>
         <w:t>D. Compression Gating &amp; Feature Fusion</w:t>
       </w:r>
     </w:p>
     <w:p>
-      <w:pPr>
-        <w:spacing w:after="80" w:line="276" w:lineRule="auto"/>
-      </w:pPr>
       <w:r>
         <w:t>Video compression attenuates high-frequency noise. We pass the input through a single-channel compression gating network $g(X) \in [0, 1]$ to scale spatial frequency activations:</w:t>
       </w:r>
     </w:p>
     <w:p>
-      <w:pPr>
-        <w:spacing w:after="80" w:line="276" w:lineRule="auto"/>
-      </w:pPr>
       <w:r>
         <w:t>$$F_{\text{gated}} = F_{\text{spatial}} \cdot g(X)$$</w:t>
       </w:r>
     </w:p>
     <w:p>
-      <w:pPr>
-        <w:spacing w:after="80" w:line="276" w:lineRule="auto"/>
-      </w:pPr>
       <w:r>
         <w:t>$$v_{\text{freq}} = \text{AdaptiveAvgPool2D}(F_{\text{gated}}) \in \mathbb{R}^{128}$$</w:t>
       </w:r>
     </w:p>
     <w:p>
-      <w:pPr>
-        <w:spacing w:after="80" w:line="276" w:lineRule="auto"/>
-      </w:pPr>
       <w:r>
         <w:t>The semantic vector and pooled frequency vector are concatenated into a unified 384-dimensional representation and projected through a Fusion MLP:</w:t>
       </w:r>
     </w:p>
     <w:p>
-      <w:pPr>
-        <w:spacing w:after="80" w:line="276" w:lineRule="auto"/>
-      </w:pPr>
       <w:r>
         <w:t>$$v_{\text{fused}} = \text{ReLU}\left(\text{BatchNorm}\left(\text{Linear}_{384 \to 256}\left([f_{\text{semantic}} \, \Vert \, v_{\text{freq}}]\right)\right)\right) \in \mathbb{R}^{256}$$</w:t>
       </w:r>
     </w:p>
     <w:p>
-      <w:pPr>
-        <w:spacing w:after="120"/>
-      </w:pPr>
+      <w:r>
+        <w:t>---</w:t>
+      </w:r>
     </w:p>
     <w:p>
       <w:pPr>
-        <w:pStyle w:val="Heading3"/>
-        <w:jc w:val="left"/>
+        <w:pStyle w:val="Heading2"/>
       </w:pPr>
       <w:r>
         <w:t>E. Dual Output Heads &amp; Joint Optimization Loss</w:t>
       </w:r>
     </w:p>
     <w:p>
-      <w:pPr>
-        <w:spacing w:after="80" w:line="276" w:lineRule="auto"/>
-      </w:pPr>
       <w:r>
-        <w:t>1. Classification Head: A linear layer outputs the predicted binary classification logit $\hat{y} \in \mathbb{R}$:</w:t>
+        <w:t>1. **Classification Head:** A linear layer outputs the predicted binary classification logit $\hat{y} \in \mathbb{R}$:</w:t>
       </w:r>
     </w:p>
     <w:p>
-      <w:pPr>
-        <w:spacing w:after="80" w:line="276" w:lineRule="auto"/>
-      </w:pPr>
       <w:r>
         <w:t>$$\mathcal{L}_{\text{cls}} = \text{BCEWithLogits}(\hat{y}, y)$$</w:t>
       </w:r>
     </w:p>
     <w:p>
-      <w:pPr>
-        <w:spacing w:after="80" w:line="276" w:lineRule="auto"/>
-      </w:pPr>
       <w:r>
-        <w:t>2. Spatial Localization Head: A $1 \times 1$ convolution followed by Sigmoid upsamples $F_{\text{gated}}$ to predict a $224 \times 224$ manipulation heatmap $M_{\text{pred}} \in [0, 1]^{H \times W}$. To prevent half-precision FP16 underflow under PyTorch AMP ($\log(0) = -\infty$), heatmaps are clamped to $[10^{-6}, 1 - 10^{-6}]$:</w:t>
+        <w:t>2. **Spatial Localization Head:** A $1 \times 1$ convolution followed by Sigmoid upsamples $F_{\text{gated}}$ to predict a $224 \times 224$ manipulation heatmap $M_{\text{pred}} \in [0, 1]^{H \times W}$. To prevent half-precision FP16 underflow under PyTorch AMP ($\log(0) = -\infty$), heatmaps are clamped to $[10^{-6}, 1 - 10^{-6}]$:</w:t>
       </w:r>
     </w:p>
     <w:p>
-      <w:pPr>
-        <w:spacing w:after="80" w:line="276" w:lineRule="auto"/>
-      </w:pPr>
       <w:r>
         <w:t>$$\mathcal{L}_{\text{mask}} = \text{BCE}\left(\text{clamp}(M_{\text{pred}}, 10^{-6}, 1-10^{-6}), M_{\text{gt}}\right)$$</w:t>
       </w:r>
     </w:p>
     <w:p>
-      <w:pPr>
-        <w:spacing w:after="80" w:line="276" w:lineRule="auto"/>
-      </w:pPr>
       <w:r>
-        <w:t>3. Total Objective Function: The model is trained end-to-end minimizing:</w:t>
+        <w:t>3. **Total Objective Function:** The model is trained end-to-end minimizing:</w:t>
       </w:r>
     </w:p>
     <w:p>
-      <w:pPr>
-        <w:spacing w:after="80" w:line="276" w:lineRule="auto"/>
-      </w:pPr>
       <w:r>
         <w:t>$$\mathcal{L}_{\text{total}} = \mathcal{L}_{\text{cls}} + \lambda_{\text{mask}} \cdot \mathcal{L}_{\text{mask}} \quad (\text{with } \lambda_{\text{mask}} = 2.0)$$</w:t>
       </w:r>
     </w:p>
     <w:p>
-      <w:pPr>
-        <w:spacing w:after="120"/>
-      </w:pPr>
+      <w:r>
+        <w:t>---</w:t>
+      </w:r>
     </w:p>
     <w:p>
       <w:pPr>
-        <w:pStyle w:val="Heading2"/>
-        <w:spacing w:before="200" w:after="80"/>
-        <w:jc w:val="left"/>
+        <w:pStyle w:val="Heading1"/>
       </w:pPr>
       <w:r>
         <w:t>IV. Experimental Setup &amp; Results</w:t>
@@ -1353,8 +401,7 @@
     </w:p>
     <w:p>
       <w:pPr>
-        <w:pStyle w:val="Heading3"/>
-        <w:jc w:val="left"/>
+        <w:pStyle w:val="Heading2"/>
       </w:pPr>
       <w:r>
         <w:t>A. Experimental Setup &amp; Hardware</w:t>
@@ -1363,48 +410,41 @@
     <w:p>
       <w:pPr>
         <w:pStyle w:val="ListBullet"/>
-        <w:spacing w:after="40"/>
       </w:pPr>
       <w:r>
-        <w:t>Hardware Platform: NVIDIA DGX Node with 1x NVIDIA A100-SXM4-40GB GPU.</w:t>
+        <w:t>**Hardware Platform:** NVIDIA DGX Node with 1x NVIDIA A100-SXM4-40GB GPU.</w:t>
       </w:r>
     </w:p>
     <w:p>
       <w:pPr>
         <w:pStyle w:val="ListBullet"/>
-        <w:spacing w:after="40"/>
       </w:pPr>
       <w:r>
-        <w:t>Software Stack: PyTorch 2.2.2+cu121, torchvision 0.17.2, timm 1.0.28, open_clip_torch 3.3.0, CUDA 12.1.</w:t>
+        <w:t>**Software Stack:** PyTorch 2.2.2+cu121, torchvision 0.17.2, timm 1.0.28, open_clip_torch 3.3.0, CUDA 12.1.</w:t>
       </w:r>
     </w:p>
     <w:p>
       <w:pPr>
         <w:pStyle w:val="ListBullet"/>
-        <w:spacing w:after="40"/>
       </w:pPr>
       <w:r>
-        <w:t>Hyperparameters: AdamW optimizer ($\text{lr} = 10^{-4}$, $\text{weight\_decay} = 10^{-4}$), Cosine Annealing scheduler, batch size 32, 30 epochs with early stopping patience 10. Gradient clipping ($\text{max\_norm} = 1.0$) was enforced before optimizer steps.</w:t>
+        <w:t>**Hyperparameters:** AdamW optimizer ($\text{lr} = 10^{-4}$, $\text{weight\_decay} = 10^{-4}$), Cosine Annealing scheduler, batch size 32, 30 epochs with early stopping patience 10. Gradient clipping ($\text{max\_norm} = 1.0$) was enforced before optimizer steps.</w:t>
+      </w:r>
+    </w:p>
+    <w:p>
+      <w:r>
+        <w:t>---</w:t>
       </w:r>
     </w:p>
     <w:p>
       <w:pPr>
-        <w:spacing w:after="120"/>
-      </w:pPr>
-    </w:p>
-    <w:p>
-      <w:pPr>
-        <w:pStyle w:val="Heading3"/>
-        <w:jc w:val="left"/>
+        <w:pStyle w:val="Heading2"/>
       </w:pPr>
       <w:r>
         <w:t>B. Official In-Dataset Benchmark (FaceForensics++ C23 Test Split)</w:t>
       </w:r>
     </w:p>
     <w:p>
-      <w:pPr>
-        <w:spacing w:after="80" w:line="276" w:lineRule="auto"/>
-      </w:pPr>
       <w:r>
         <w:t>Table II presents the performance comparison on the official test split (22,397 face frames across 700 videos).</w:t>
       </w:r>
@@ -1412,576 +452,30 @@
     <w:p>
       <w:pPr>
         <w:pStyle w:val="Heading3"/>
-        <w:jc w:val="left"/>
       </w:pPr>
       <w:r>
         <w:t>TABLE II: In-Dataset Performance Comparison on FaceForensics++ C23</w:t>
       </w:r>
     </w:p>
-    <w:tbl>
-      <w:tblPr>
-        <w:tblW w:type="auto" w:w="0"/>
-        <w:jc w:val="center"/>
-        <w:tblLook w:firstColumn="1" w:firstRow="1" w:lastColumn="0" w:lastRow="0" w:noHBand="0" w:noVBand="1" w:val="04A0"/>
-      </w:tblPr>
-      <w:tblGrid>
-        <w:gridCol w:w="1170"/>
-        <w:gridCol w:w="1170"/>
-        <w:gridCol w:w="1170"/>
-        <w:gridCol w:w="1170"/>
-        <w:gridCol w:w="1170"/>
-        <w:gridCol w:w="1170"/>
-        <w:gridCol w:w="1170"/>
-        <w:gridCol w:w="1170"/>
-      </w:tblGrid>
-      <w:tr>
-        <w:tc>
-          <w:tcPr>
-            <w:tcW w:type="dxa" w:w="1170"/>
-          </w:tcPr>
-          <w:p>
-            <w:r>
-              <w:rPr>
-                <w:b/>
-              </w:rPr>
-              <w:t>Model Architecture</w:t>
-            </w:r>
-          </w:p>
-        </w:tc>
-        <w:tc>
-          <w:tcPr>
-            <w:tcW w:type="dxa" w:w="1170"/>
-          </w:tcPr>
-          <w:p>
-            <w:r>
-              <w:rPr>
-                <w:b/>
-              </w:rPr>
-              <w:t>Overall AUC</w:t>
-            </w:r>
-          </w:p>
-        </w:tc>
-        <w:tc>
-          <w:tcPr>
-            <w:tcW w:type="dxa" w:w="1170"/>
-          </w:tcPr>
-          <w:p>
-            <w:r>
-              <w:rPr>
-                <w:b/>
-              </w:rPr>
-              <w:t>Average Precision (AP)</w:t>
-            </w:r>
-          </w:p>
-        </w:tc>
-        <w:tc>
-          <w:tcPr>
-            <w:tcW w:type="dxa" w:w="1170"/>
-          </w:tcPr>
-          <w:p>
-            <w:r>
-              <w:rPr>
-                <w:b/>
-              </w:rPr>
-              <w:t>Equal Error Rate (EER)</w:t>
-            </w:r>
-          </w:p>
-        </w:tc>
-        <w:tc>
-          <w:tcPr>
-            <w:tcW w:type="dxa" w:w="1170"/>
-          </w:tcPr>
-          <w:p>
-            <w:r>
-              <w:rPr>
-                <w:b/>
-              </w:rPr>
-              <w:t>Balanced Accuracy</w:t>
-            </w:r>
-          </w:p>
-        </w:tc>
-        <w:tc>
-          <w:tcPr>
-            <w:tcW w:type="dxa" w:w="1170"/>
-          </w:tcPr>
-          <w:p>
-            <w:r>
-              <w:rPr>
-                <w:b/>
-              </w:rPr>
-              <w:t>Raw Accuracy</w:t>
-            </w:r>
-          </w:p>
-        </w:tc>
-        <w:tc>
-          <w:tcPr>
-            <w:tcW w:type="dxa" w:w="1170"/>
-          </w:tcPr>
-          <w:p>
-            <w:r>
-              <w:rPr>
-                <w:b/>
-              </w:rPr>
-              <w:t>Pointing Game Acc</w:t>
-            </w:r>
-          </w:p>
-        </w:tc>
-        <w:tc>
-          <w:tcPr>
-            <w:tcW w:type="dxa" w:w="1170"/>
-          </w:tcPr>
-          <w:p>
-            <w:r>
-              <w:rPr>
-                <w:b/>
-              </w:rPr>
-              <w:t>Mask IoU (@ 0.05)</w:t>
-            </w:r>
-          </w:p>
-        </w:tc>
-      </w:tr>
-      <w:tr>
-        <w:tc>
-          <w:tcPr>
-            <w:tcW w:type="dxa" w:w="1170"/>
-          </w:tcPr>
-          <w:p>
-            <w:r>
-              <w:t>Xception Baseline</w:t>
-            </w:r>
-          </w:p>
-        </w:tc>
-        <w:tc>
-          <w:tcPr>
-            <w:tcW w:type="dxa" w:w="1170"/>
-          </w:tcPr>
-          <w:p>
-            <w:r>
-              <w:t>98.38%</w:t>
-            </w:r>
-          </w:p>
-        </w:tc>
-        <w:tc>
-          <w:tcPr>
-            <w:tcW w:type="dxa" w:w="1170"/>
-          </w:tcPr>
-          <w:p>
-            <w:r>
-              <w:t>99.62%</w:t>
-            </w:r>
-          </w:p>
-        </w:tc>
-        <w:tc>
-          <w:tcPr>
-            <w:tcW w:type="dxa" w:w="1170"/>
-          </w:tcPr>
-          <w:p>
-            <w:r>
-              <w:t>5.20%</w:t>
-            </w:r>
-          </w:p>
-        </w:tc>
-        <w:tc>
-          <w:tcPr>
-            <w:tcW w:type="dxa" w:w="1170"/>
-          </w:tcPr>
-          <w:p>
-            <w:r>
-              <w:t>94.36%</w:t>
-            </w:r>
-          </w:p>
-        </w:tc>
-        <w:tc>
-          <w:tcPr>
-            <w:tcW w:type="dxa" w:w="1170"/>
-          </w:tcPr>
-          <w:p>
-            <w:r>
-              <w:t>95.18%</w:t>
-            </w:r>
-          </w:p>
-        </w:tc>
-        <w:tc>
-          <w:tcPr>
-            <w:tcW w:type="dxa" w:w="1170"/>
-          </w:tcPr>
-          <w:p>
-            <w:r>
-              <w:t>N/A</w:t>
-            </w:r>
-          </w:p>
-        </w:tc>
-        <w:tc>
-          <w:tcPr>
-            <w:tcW w:type="dxa" w:w="1170"/>
-          </w:tcPr>
-          <w:p>
-            <w:r>
-              <w:t>N/A</w:t>
-            </w:r>
-          </w:p>
-        </w:tc>
-      </w:tr>
-      <w:tr>
-        <w:tc>
-          <w:tcPr>
-            <w:tcW w:type="dxa" w:w="1170"/>
-          </w:tcPr>
-          <w:p>
-            <w:r>
-              <w:t>Premier Fusion Model v4</w:t>
-            </w:r>
-          </w:p>
-        </w:tc>
-        <w:tc>
-          <w:tcPr>
-            <w:tcW w:type="dxa" w:w="1170"/>
-          </w:tcPr>
-          <w:p>
-            <w:r>
-              <w:t>91.07% 🔥</w:t>
-            </w:r>
-          </w:p>
-        </w:tc>
-        <w:tc>
-          <w:tcPr>
-            <w:tcW w:type="dxa" w:w="1170"/>
-          </w:tcPr>
-          <w:p>
-            <w:r>
-              <w:t>97.59% 📈</w:t>
-            </w:r>
-          </w:p>
-        </w:tc>
-        <w:tc>
-          <w:tcPr>
-            <w:tcW w:type="dxa" w:w="1170"/>
-          </w:tcPr>
-          <w:p>
-            <w:r>
-              <w:t>17.15% 📉</w:t>
-            </w:r>
-          </w:p>
-        </w:tc>
-        <w:tc>
-          <w:tcPr>
-            <w:tcW w:type="dxa" w:w="1170"/>
-          </w:tcPr>
-          <w:p>
-            <w:r>
-              <w:t>83.05% ⚖️</w:t>
-            </w:r>
-          </w:p>
-        </w:tc>
-        <w:tc>
-          <w:tcPr>
-            <w:tcW w:type="dxa" w:w="1170"/>
-          </w:tcPr>
-          <w:p>
-            <w:r>
-              <w:t>82.28%</w:t>
-            </w:r>
-          </w:p>
-        </w:tc>
-        <w:tc>
-          <w:tcPr>
-            <w:tcW w:type="dxa" w:w="1170"/>
-          </w:tcPr>
-          <w:p>
-            <w:r>
-              <w:t>88.84% 🚀</w:t>
-            </w:r>
-          </w:p>
-        </w:tc>
-        <w:tc>
-          <w:tcPr>
-            <w:tcW w:type="dxa" w:w="1170"/>
-          </w:tcPr>
-          <w:p>
-            <w:r>
-              <w:t>57.84% 🎯</w:t>
-            </w:r>
-          </w:p>
-        </w:tc>
-      </w:tr>
-      <w:tr>
-        <w:tc>
-          <w:tcPr>
-            <w:tcW w:type="dxa" w:w="1170"/>
-          </w:tcPr>
-          <w:p>
-            <w:r>
-              <w:t>Novel Fusion Model v3</w:t>
-            </w:r>
-          </w:p>
-        </w:tc>
-        <w:tc>
-          <w:tcPr>
-            <w:tcW w:type="dxa" w:w="1170"/>
-          </w:tcPr>
-          <w:p>
-            <w:r>
-              <w:t>87.85%</w:t>
-            </w:r>
-          </w:p>
-        </w:tc>
-        <w:tc>
-          <w:tcPr>
-            <w:tcW w:type="dxa" w:w="1170"/>
-          </w:tcPr>
-          <w:p>
-            <w:r>
-              <w:t>96.39%</w:t>
-            </w:r>
-          </w:p>
-        </w:tc>
-        <w:tc>
-          <w:tcPr>
-            <w:tcW w:type="dxa" w:w="1170"/>
-          </w:tcPr>
-          <w:p>
-            <w:r>
-              <w:t>19.58%</w:t>
-            </w:r>
-          </w:p>
-        </w:tc>
-        <w:tc>
-          <w:tcPr>
-            <w:tcW w:type="dxa" w:w="1170"/>
-          </w:tcPr>
-          <w:p>
-            <w:r>
-              <w:t>79.90%</w:t>
-            </w:r>
-          </w:p>
-        </w:tc>
-        <w:tc>
-          <w:tcPr>
-            <w:tcW w:type="dxa" w:w="1170"/>
-          </w:tcPr>
-          <w:p>
-            <w:r>
-              <w:t>82.42%</w:t>
-            </w:r>
-          </w:p>
-        </w:tc>
-        <w:tc>
-          <w:tcPr>
-            <w:tcW w:type="dxa" w:w="1170"/>
-          </w:tcPr>
-          <w:p>
-            <w:r>
-              <w:t>75.55%</w:t>
-            </w:r>
-          </w:p>
-        </w:tc>
-        <w:tc>
-          <w:tcPr>
-            <w:tcW w:type="dxa" w:w="1170"/>
-          </w:tcPr>
-          <w:p>
-            <w:r>
-              <w:t>41.76%</w:t>
-            </w:r>
-          </w:p>
-        </w:tc>
-      </w:tr>
-      <w:tr>
-        <w:tc>
-          <w:tcPr>
-            <w:tcW w:type="dxa" w:w="1170"/>
-          </w:tcPr>
-          <w:p>
-            <w:r>
-              <w:t>TriConsistencyNet</w:t>
-            </w:r>
-          </w:p>
-        </w:tc>
-        <w:tc>
-          <w:tcPr>
-            <w:tcW w:type="dxa" w:w="1170"/>
-          </w:tcPr>
-          <w:p>
-            <w:r>
-              <w:t>80.66%</w:t>
-            </w:r>
-          </w:p>
-        </w:tc>
-        <w:tc>
-          <w:tcPr>
-            <w:tcW w:type="dxa" w:w="1170"/>
-          </w:tcPr>
-          <w:p>
-            <w:r>
-              <w:t>93.97%</w:t>
-            </w:r>
-          </w:p>
-        </w:tc>
-        <w:tc>
-          <w:tcPr>
-            <w:tcW w:type="dxa" w:w="1170"/>
-          </w:tcPr>
-          <w:p>
-            <w:r>
-              <w:t>27.22%</w:t>
-            </w:r>
-          </w:p>
-        </w:tc>
-        <w:tc>
-          <w:tcPr>
-            <w:tcW w:type="dxa" w:w="1170"/>
-          </w:tcPr>
-          <w:p>
-            <w:r>
-              <w:t>67.91%</w:t>
-            </w:r>
-          </w:p>
-        </w:tc>
-        <w:tc>
-          <w:tcPr>
-            <w:tcW w:type="dxa" w:w="1170"/>
-          </w:tcPr>
-          <w:p>
-            <w:r>
-              <w:t>80.77%</w:t>
-            </w:r>
-          </w:p>
-        </w:tc>
-        <w:tc>
-          <w:tcPr>
-            <w:tcW w:type="dxa" w:w="1170"/>
-          </w:tcPr>
-          <w:p>
-            <w:r>
-              <w:t>N/A</w:t>
-            </w:r>
-          </w:p>
-        </w:tc>
-        <w:tc>
-          <w:tcPr>
-            <w:tcW w:type="dxa" w:w="1170"/>
-          </w:tcPr>
-          <w:p>
-            <w:r>
-              <w:t>N/A</w:t>
-            </w:r>
-          </w:p>
-        </w:tc>
-      </w:tr>
-      <w:tr>
-        <w:tc>
-          <w:tcPr>
-            <w:tcW w:type="dxa" w:w="1170"/>
-          </w:tcPr>
-          <w:p>
-            <w:r>
-              <w:t>SBI Baseline</w:t>
-            </w:r>
-          </w:p>
-        </w:tc>
-        <w:tc>
-          <w:tcPr>
-            <w:tcW w:type="dxa" w:w="1170"/>
-          </w:tcPr>
-          <w:p>
-            <w:r>
-              <w:t>71.10%</w:t>
-            </w:r>
-          </w:p>
-        </w:tc>
-        <w:tc>
-          <w:tcPr>
-            <w:tcW w:type="dxa" w:w="1170"/>
-          </w:tcPr>
-          <w:p>
-            <w:r>
-              <w:t>90.31%</w:t>
-            </w:r>
-          </w:p>
-        </w:tc>
-        <w:tc>
-          <w:tcPr>
-            <w:tcW w:type="dxa" w:w="1170"/>
-          </w:tcPr>
-          <w:p>
-            <w:r>
-              <w:t>34.96%</w:t>
-            </w:r>
-          </w:p>
-        </w:tc>
-        <w:tc>
-          <w:tcPr>
-            <w:tcW w:type="dxa" w:w="1170"/>
-          </w:tcPr>
-          <w:p>
-            <w:r>
-              <w:t>53.37%</w:t>
-            </w:r>
-          </w:p>
-        </w:tc>
-        <w:tc>
-          <w:tcPr>
-            <w:tcW w:type="dxa" w:w="1170"/>
-          </w:tcPr>
-          <w:p>
-            <w:r>
-              <w:t>25.95%*</w:t>
-            </w:r>
-          </w:p>
-        </w:tc>
-        <w:tc>
-          <w:tcPr>
-            <w:tcW w:type="dxa" w:w="1170"/>
-          </w:tcPr>
-          <w:p>
-            <w:r>
-              <w:t>N/A</w:t>
-            </w:r>
-          </w:p>
-        </w:tc>
-        <w:tc>
-          <w:tcPr>
-            <w:tcW w:type="dxa" w:w="1170"/>
-          </w:tcPr>
-          <w:p>
-            <w:r>
-              <w:t>N/A</w:t>
-            </w:r>
-          </w:p>
-        </w:tc>
-      </w:tr>
-    </w:tbl>
     <w:p>
-      <w:pPr>
-        <w:spacing w:after="120"/>
-      </w:pPr>
+      <w:r>
+        <w:t>*\*Note on SBI: Raw accuracy of 25.95% is due to threshold miscalibration. Discrimination power is reflected by AUC (71.10%) and Balanced Acc (53.37%).*</w:t>
+      </w:r>
     </w:p>
     <w:p>
-      <w:pPr>
-        <w:spacing w:after="80" w:line="276" w:lineRule="auto"/>
-      </w:pPr>
       <w:r>
-        <w:t>\Note on SBI: Raw accuracy of 25.95% is due to threshold miscalibration. Discrimination power is reflected by AUC (71.10%) and Balanced Acc (53.37%).*</w:t>
+        <w:t>---</w:t>
       </w:r>
     </w:p>
     <w:p>
       <w:pPr>
-        <w:spacing w:after="120"/>
-      </w:pPr>
-    </w:p>
-    <w:p>
-      <w:pPr>
-        <w:pStyle w:val="Heading3"/>
-        <w:jc w:val="left"/>
+        <w:pStyle w:val="Heading2"/>
       </w:pPr>
       <w:r>
         <w:t>C. In-Dataset Per-Manipulation Method AUC Breakdown</w:t>
       </w:r>
     </w:p>
     <w:p>
-      <w:pPr>
-        <w:spacing w:after="80" w:line="276" w:lineRule="auto"/>
-      </w:pPr>
       <w:r>
         <w:t>Table III details performance across the 4 specific FF++ forgery algorithms.</w:t>
       </w:r>
@@ -1989,746 +483,61 @@
     <w:p>
       <w:pPr>
         <w:pStyle w:val="Heading3"/>
-        <w:jc w:val="left"/>
       </w:pPr>
       <w:r>
         <w:t>TABLE III: Per-Method Forgery AUC Breakdown (%)</w:t>
       </w:r>
     </w:p>
-    <w:tbl>
-      <w:tblPr>
-        <w:tblW w:type="auto" w:w="0"/>
-        <w:jc w:val="center"/>
-        <w:tblLook w:firstColumn="1" w:firstRow="1" w:lastColumn="0" w:lastRow="0" w:noHBand="0" w:noVBand="1" w:val="04A0"/>
-      </w:tblPr>
-      <w:tblGrid>
-        <w:gridCol w:w="1872"/>
-        <w:gridCol w:w="1872"/>
-        <w:gridCol w:w="1872"/>
-        <w:gridCol w:w="1872"/>
-        <w:gridCol w:w="1872"/>
-      </w:tblGrid>
-      <w:tr>
-        <w:tc>
-          <w:tcPr>
-            <w:tcW w:type="dxa" w:w="1872"/>
-          </w:tcPr>
-          <w:p>
-            <w:r>
-              <w:rPr>
-                <w:b/>
-              </w:rPr>
-              <w:t>Model Architecture</w:t>
-            </w:r>
-          </w:p>
-        </w:tc>
-        <w:tc>
-          <w:tcPr>
-            <w:tcW w:type="dxa" w:w="1872"/>
-          </w:tcPr>
-          <w:p>
-            <w:r>
-              <w:rPr>
-                <w:b/>
-              </w:rPr>
-              <w:t>Deepfakes (DF)</w:t>
-            </w:r>
-          </w:p>
-        </w:tc>
-        <w:tc>
-          <w:tcPr>
-            <w:tcW w:type="dxa" w:w="1872"/>
-          </w:tcPr>
-          <w:p>
-            <w:r>
-              <w:rPr>
-                <w:b/>
-              </w:rPr>
-              <w:t>Face2Face (F2F)</w:t>
-            </w:r>
-          </w:p>
-        </w:tc>
-        <w:tc>
-          <w:tcPr>
-            <w:tcW w:type="dxa" w:w="1872"/>
-          </w:tcPr>
-          <w:p>
-            <w:r>
-              <w:rPr>
-                <w:b/>
-              </w:rPr>
-              <w:t>FaceSwap (FS)</w:t>
-            </w:r>
-          </w:p>
-        </w:tc>
-        <w:tc>
-          <w:tcPr>
-            <w:tcW w:type="dxa" w:w="1872"/>
-          </w:tcPr>
-          <w:p>
-            <w:r>
-              <w:rPr>
-                <w:b/>
-              </w:rPr>
-              <w:t>NeuralTextures (NT)</w:t>
-            </w:r>
-          </w:p>
-        </w:tc>
-      </w:tr>
-      <w:tr>
-        <w:tc>
-          <w:tcPr>
-            <w:tcW w:type="dxa" w:w="1872"/>
-          </w:tcPr>
-          <w:p>
-            <w:r>
-              <w:t>Xception Baseline</w:t>
-            </w:r>
-          </w:p>
-        </w:tc>
-        <w:tc>
-          <w:tcPr>
-            <w:tcW w:type="dxa" w:w="1872"/>
-          </w:tcPr>
-          <w:p>
-            <w:r>
-              <w:t>99.14%</w:t>
-            </w:r>
-          </w:p>
-        </w:tc>
-        <w:tc>
-          <w:tcPr>
-            <w:tcW w:type="dxa" w:w="1872"/>
-          </w:tcPr>
-          <w:p>
-            <w:r>
-              <w:t>98.88%</w:t>
-            </w:r>
-          </w:p>
-        </w:tc>
-        <w:tc>
-          <w:tcPr>
-            <w:tcW w:type="dxa" w:w="1872"/>
-          </w:tcPr>
-          <w:p>
-            <w:r>
-              <w:t>98.45%</w:t>
-            </w:r>
-          </w:p>
-        </w:tc>
-        <w:tc>
-          <w:tcPr>
-            <w:tcW w:type="dxa" w:w="1872"/>
-          </w:tcPr>
-          <w:p>
-            <w:r>
-              <w:t>97.03%</w:t>
-            </w:r>
-          </w:p>
-        </w:tc>
-      </w:tr>
-      <w:tr>
-        <w:tc>
-          <w:tcPr>
-            <w:tcW w:type="dxa" w:w="1872"/>
-          </w:tcPr>
-          <w:p>
-            <w:r>
-              <w:t>Premier Fusion Model v4</w:t>
-            </w:r>
-          </w:p>
-        </w:tc>
-        <w:tc>
-          <w:tcPr>
-            <w:tcW w:type="dxa" w:w="1872"/>
-          </w:tcPr>
-          <w:p>
-            <w:r>
-              <w:t>95.06% 🔥</w:t>
-            </w:r>
-          </w:p>
-        </w:tc>
-        <w:tc>
-          <w:tcPr>
-            <w:tcW w:type="dxa" w:w="1872"/>
-          </w:tcPr>
-          <w:p>
-            <w:r>
-              <w:t>91.88% 🔥</w:t>
-            </w:r>
-          </w:p>
-        </w:tc>
-        <w:tc>
-          <w:tcPr>
-            <w:tcW w:type="dxa" w:w="1872"/>
-          </w:tcPr>
-          <w:p>
-            <w:r>
-              <w:t>91.88% 🔥</w:t>
-            </w:r>
-          </w:p>
-        </w:tc>
-        <w:tc>
-          <w:tcPr>
-            <w:tcW w:type="dxa" w:w="1872"/>
-          </w:tcPr>
-          <w:p>
-            <w:r>
-              <w:t>85.47% 🔥</w:t>
-            </w:r>
-          </w:p>
-        </w:tc>
-      </w:tr>
-      <w:tr>
-        <w:tc>
-          <w:tcPr>
-            <w:tcW w:type="dxa" w:w="1872"/>
-          </w:tcPr>
-          <w:p>
-            <w:r>
-              <w:t>Novel Fusion Model v3</w:t>
-            </w:r>
-          </w:p>
-        </w:tc>
-        <w:tc>
-          <w:tcPr>
-            <w:tcW w:type="dxa" w:w="1872"/>
-          </w:tcPr>
-          <w:p>
-            <w:r>
-              <w:t>93.62%</w:t>
-            </w:r>
-          </w:p>
-        </w:tc>
-        <w:tc>
-          <w:tcPr>
-            <w:tcW w:type="dxa" w:w="1872"/>
-          </w:tcPr>
-          <w:p>
-            <w:r>
-              <w:t>87.41%</w:t>
-            </w:r>
-          </w:p>
-        </w:tc>
-        <w:tc>
-          <w:tcPr>
-            <w:tcW w:type="dxa" w:w="1872"/>
-          </w:tcPr>
-          <w:p>
-            <w:r>
-              <w:t>89.23%</w:t>
-            </w:r>
-          </w:p>
-        </w:tc>
-        <w:tc>
-          <w:tcPr>
-            <w:tcW w:type="dxa" w:w="1872"/>
-          </w:tcPr>
-          <w:p>
-            <w:r>
-              <w:t>81.13%</w:t>
-            </w:r>
-          </w:p>
-        </w:tc>
-      </w:tr>
-      <w:tr>
-        <w:tc>
-          <w:tcPr>
-            <w:tcW w:type="dxa" w:w="1872"/>
-          </w:tcPr>
-          <w:p>
-            <w:r>
-              <w:t>TriConsistencyNet</w:t>
-            </w:r>
-          </w:p>
-        </w:tc>
-        <w:tc>
-          <w:tcPr>
-            <w:tcW w:type="dxa" w:w="1872"/>
-          </w:tcPr>
-          <w:p>
-            <w:r>
-              <w:t>84.37%</w:t>
-            </w:r>
-          </w:p>
-        </w:tc>
-        <w:tc>
-          <w:tcPr>
-            <w:tcW w:type="dxa" w:w="1872"/>
-          </w:tcPr>
-          <w:p>
-            <w:r>
-              <w:t>81.13%</w:t>
-            </w:r>
-          </w:p>
-        </w:tc>
-        <w:tc>
-          <w:tcPr>
-            <w:tcW w:type="dxa" w:w="1872"/>
-          </w:tcPr>
-          <w:p>
-            <w:r>
-              <w:t>79.93%</w:t>
-            </w:r>
-          </w:p>
-        </w:tc>
-        <w:tc>
-          <w:tcPr>
-            <w:tcW w:type="dxa" w:w="1872"/>
-          </w:tcPr>
-          <w:p>
-            <w:r>
-              <w:t>77.22%</w:t>
-            </w:r>
-          </w:p>
-        </w:tc>
-      </w:tr>
-      <w:tr>
-        <w:tc>
-          <w:tcPr>
-            <w:tcW w:type="dxa" w:w="1872"/>
-          </w:tcPr>
-          <w:p>
-            <w:r>
-              <w:t>SBI Baseline</w:t>
-            </w:r>
-          </w:p>
-        </w:tc>
-        <w:tc>
-          <w:tcPr>
-            <w:tcW w:type="dxa" w:w="1872"/>
-          </w:tcPr>
-          <w:p>
-            <w:r>
-              <w:t>81.26%</w:t>
-            </w:r>
-          </w:p>
-        </w:tc>
-        <w:tc>
-          <w:tcPr>
-            <w:tcW w:type="dxa" w:w="1872"/>
-          </w:tcPr>
-          <w:p>
-            <w:r>
-              <w:t>71.01%</w:t>
-            </w:r>
-          </w:p>
-        </w:tc>
-        <w:tc>
-          <w:tcPr>
-            <w:tcW w:type="dxa" w:w="1872"/>
-          </w:tcPr>
-          <w:p>
-            <w:r>
-              <w:t>64.47%</w:t>
-            </w:r>
-          </w:p>
-        </w:tc>
-        <w:tc>
-          <w:tcPr>
-            <w:tcW w:type="dxa" w:w="1872"/>
-          </w:tcPr>
-          <w:p>
-            <w:r>
-              <w:t>67.65%</w:t>
-            </w:r>
-          </w:p>
-        </w:tc>
-      </w:tr>
-    </w:tbl>
     <w:p>
-      <w:pPr>
-        <w:spacing w:after="120"/>
-      </w:pPr>
+      <w:r>
+        <w:t>---</w:t>
+      </w:r>
     </w:p>
     <w:p>
       <w:pPr>
-        <w:spacing w:after="120"/>
-      </w:pPr>
-    </w:p>
-    <w:p>
-      <w:pPr>
-        <w:pStyle w:val="Heading3"/>
-        <w:jc w:val="left"/>
+        <w:pStyle w:val="Heading2"/>
       </w:pPr>
       <w:r>
         <w:t>D. Zero-Shot Cross-Domain Generalization (DeepFakeFace Dataset)</w:t>
       </w:r>
     </w:p>
     <w:p>
-      <w:pPr>
-        <w:spacing w:after="80" w:line="276" w:lineRule="auto"/>
-      </w:pPr>
       <w:r>
-        <w:t>To test true cross-domain generalizability, models trained strictly on FF++ (GANs) were evaluated zero-shot on DeepFakeFace (DFF) (10,000 images generated via Stable Diffusion v1.5, SD Inpainting, and InsightFace) without any fine-tuning.</w:t>
+        <w:t>To test true cross-domain generalizability, models trained **strictly on FF++ (GANs)** were evaluated zero-shot on **DeepFakeFace (DFF)** (10,000 images generated via **Stable Diffusion v1.5**, **SD Inpainting**, and **InsightFace**) without any fine-tuning.</w:t>
       </w:r>
     </w:p>
     <w:p>
       <w:pPr>
         <w:pStyle w:val="Heading3"/>
-        <w:jc w:val="left"/>
       </w:pPr>
       <w:r>
         <w:t>TABLE IV: Zero-Shot Cross-Domain Performance on DeepFakeFace (Diffusion Models)</w:t>
       </w:r>
     </w:p>
-    <w:tbl>
-      <w:tblPr>
-        <w:tblW w:type="auto" w:w="0"/>
-        <w:jc w:val="center"/>
-        <w:tblLook w:firstColumn="1" w:firstRow="1" w:lastColumn="0" w:lastRow="0" w:noHBand="0" w:noVBand="1" w:val="04A0"/>
-      </w:tblPr>
-      <w:tblGrid>
-        <w:gridCol w:w="1337"/>
-        <w:gridCol w:w="1337"/>
-        <w:gridCol w:w="1337"/>
-        <w:gridCol w:w="1337"/>
-        <w:gridCol w:w="1337"/>
-        <w:gridCol w:w="1337"/>
-        <w:gridCol w:w="1337"/>
-      </w:tblGrid>
-      <w:tr>
-        <w:tc>
-          <w:tcPr>
-            <w:tcW w:type="dxa" w:w="1337"/>
-          </w:tcPr>
-          <w:p>
-            <w:r>
-              <w:rPr>
-                <w:b/>
-              </w:rPr>
-              <w:t>Model Architecture</w:t>
-            </w:r>
-          </w:p>
-        </w:tc>
-        <w:tc>
-          <w:tcPr>
-            <w:tcW w:type="dxa" w:w="1337"/>
-          </w:tcPr>
-          <w:p>
-            <w:r>
-              <w:rPr>
-                <w:b/>
-              </w:rPr>
-              <w:t>Overall Cross-Domain AUC</w:t>
-            </w:r>
-          </w:p>
-        </w:tc>
-        <w:tc>
-          <w:tcPr>
-            <w:tcW w:type="dxa" w:w="1337"/>
-          </w:tcPr>
-          <w:p>
-            <w:r>
-              <w:rPr>
-                <w:b/>
-              </w:rPr>
-              <w:t>Cross-Domain AP</w:t>
-            </w:r>
-          </w:p>
-        </w:tc>
-        <w:tc>
-          <w:tcPr>
-            <w:tcW w:type="dxa" w:w="1337"/>
-          </w:tcPr>
-          <w:p>
-            <w:r>
-              <w:rPr>
-                <w:b/>
-              </w:rPr>
-              <w:t>Cross-Domain EER</w:t>
-            </w:r>
-          </w:p>
-        </w:tc>
-        <w:tc>
-          <w:tcPr>
-            <w:tcW w:type="dxa" w:w="1337"/>
-          </w:tcPr>
-          <w:p>
-            <w:r>
-              <w:rPr>
-                <w:b/>
-              </w:rPr>
-              <w:t>InsightFace AUC</w:t>
-            </w:r>
-          </w:p>
-        </w:tc>
-        <w:tc>
-          <w:tcPr>
-            <w:tcW w:type="dxa" w:w="1337"/>
-          </w:tcPr>
-          <w:p>
-            <w:r>
-              <w:rPr>
-                <w:b/>
-              </w:rPr>
-              <w:t>SD Inpainting AUC</w:t>
-            </w:r>
-          </w:p>
-        </w:tc>
-        <w:tc>
-          <w:tcPr>
-            <w:tcW w:type="dxa" w:w="1337"/>
-          </w:tcPr>
-          <w:p>
-            <w:r>
-              <w:rPr>
-                <w:b/>
-              </w:rPr>
-              <w:t>SD Text2Img AUC</w:t>
-            </w:r>
-          </w:p>
-        </w:tc>
-      </w:tr>
-      <w:tr>
-        <w:tc>
-          <w:tcPr>
-            <w:tcW w:type="dxa" w:w="1337"/>
-          </w:tcPr>
-          <w:p>
-            <w:r>
-              <w:t>Xception Baseline</w:t>
-            </w:r>
-          </w:p>
-        </w:tc>
-        <w:tc>
-          <w:tcPr>
-            <w:tcW w:type="dxa" w:w="1337"/>
-          </w:tcPr>
-          <w:p>
-            <w:r>
-              <w:t>51.18%</w:t>
-            </w:r>
-          </w:p>
-        </w:tc>
-        <w:tc>
-          <w:tcPr>
-            <w:tcW w:type="dxa" w:w="1337"/>
-          </w:tcPr>
-          <w:p>
-            <w:r>
-              <w:t>77.18%</w:t>
-            </w:r>
-          </w:p>
-        </w:tc>
-        <w:tc>
-          <w:tcPr>
-            <w:tcW w:type="dxa" w:w="1337"/>
-          </w:tcPr>
-          <w:p>
-            <w:r>
-              <w:t>48.63%</w:t>
-            </w:r>
-          </w:p>
-        </w:tc>
-        <w:tc>
-          <w:tcPr>
-            <w:tcW w:type="dxa" w:w="1337"/>
-          </w:tcPr>
-          <w:p>
-            <w:r>
-              <w:t>56.95%</w:t>
-            </w:r>
-          </w:p>
-        </w:tc>
-        <w:tc>
-          <w:tcPr>
-            <w:tcW w:type="dxa" w:w="1337"/>
-          </w:tcPr>
-          <w:p>
-            <w:r>
-              <w:t>52.16%</w:t>
-            </w:r>
-          </w:p>
-        </w:tc>
-        <w:tc>
-          <w:tcPr>
-            <w:tcW w:type="dxa" w:w="1337"/>
-          </w:tcPr>
-          <w:p>
-            <w:r>
-              <w:t>44.42%</w:t>
-            </w:r>
-          </w:p>
-        </w:tc>
-      </w:tr>
-      <w:tr>
-        <w:tc>
-          <w:tcPr>
-            <w:tcW w:type="dxa" w:w="1337"/>
-          </w:tcPr>
-          <w:p>
-            <w:r>
-              <w:t>Premier Fusion Model v4</w:t>
-            </w:r>
-          </w:p>
-        </w:tc>
-        <w:tc>
-          <w:tcPr>
-            <w:tcW w:type="dxa" w:w="1337"/>
-          </w:tcPr>
-          <w:p>
-            <w:r>
-              <w:t>56.94% 🔥</w:t>
-            </w:r>
-          </w:p>
-        </w:tc>
-        <w:tc>
-          <w:tcPr>
-            <w:tcW w:type="dxa" w:w="1337"/>
-          </w:tcPr>
-          <w:p>
-            <w:r>
-              <w:t>80.65% 📈</w:t>
-            </w:r>
-          </w:p>
-        </w:tc>
-        <w:tc>
-          <w:tcPr>
-            <w:tcW w:type="dxa" w:w="1337"/>
-          </w:tcPr>
-          <w:p>
-            <w:r>
-              <w:t>45.43% 📉</w:t>
-            </w:r>
-          </w:p>
-        </w:tc>
-        <w:tc>
-          <w:tcPr>
-            <w:tcW w:type="dxa" w:w="1337"/>
-          </w:tcPr>
-          <w:p>
-            <w:r>
-              <w:t>62.42% 🚀</w:t>
-            </w:r>
-          </w:p>
-        </w:tc>
-        <w:tc>
-          <w:tcPr>
-            <w:tcW w:type="dxa" w:w="1337"/>
-          </w:tcPr>
-          <w:p>
-            <w:r>
-              <w:t>55.90% 🎯</w:t>
-            </w:r>
-          </w:p>
-        </w:tc>
-        <w:tc>
-          <w:tcPr>
-            <w:tcW w:type="dxa" w:w="1337"/>
-          </w:tcPr>
-          <w:p>
-            <w:r>
-              <w:t>52.50% 📈</w:t>
-            </w:r>
-          </w:p>
-        </w:tc>
-      </w:tr>
-      <w:tr>
-        <w:tc>
-          <w:tcPr>
-            <w:tcW w:type="dxa" w:w="1337"/>
-          </w:tcPr>
-          <w:p>
-            <w:r>
-              <w:t>Net Fusion Advantage</w:t>
-            </w:r>
-          </w:p>
-        </w:tc>
-        <w:tc>
-          <w:tcPr>
-            <w:tcW w:type="dxa" w:w="1337"/>
-          </w:tcPr>
-          <w:p>
-            <w:r>
-              <w:t>+5.76%</w:t>
-            </w:r>
-          </w:p>
-        </w:tc>
-        <w:tc>
-          <w:tcPr>
-            <w:tcW w:type="dxa" w:w="1337"/>
-          </w:tcPr>
-          <w:p>
-            <w:r>
-              <w:t>+3.47%</w:t>
-            </w:r>
-          </w:p>
-        </w:tc>
-        <w:tc>
-          <w:tcPr>
-            <w:tcW w:type="dxa" w:w="1337"/>
-          </w:tcPr>
-          <w:p>
-            <w:r>
-              <w:t>-3.20%</w:t>
-            </w:r>
-          </w:p>
-        </w:tc>
-        <w:tc>
-          <w:tcPr>
-            <w:tcW w:type="dxa" w:w="1337"/>
-          </w:tcPr>
-          <w:p>
-            <w:r>
-              <w:t>+5.47%</w:t>
-            </w:r>
-          </w:p>
-        </w:tc>
-        <w:tc>
-          <w:tcPr>
-            <w:tcW w:type="dxa" w:w="1337"/>
-          </w:tcPr>
-          <w:p>
-            <w:r>
-              <w:t>+3.74%</w:t>
-            </w:r>
-          </w:p>
-        </w:tc>
-        <w:tc>
-          <w:tcPr>
-            <w:tcW w:type="dxa" w:w="1337"/>
-          </w:tcPr>
-          <w:p>
-            <w:r>
-              <w:t>+8.08%</w:t>
-            </w:r>
-          </w:p>
-        </w:tc>
-      </w:tr>
-    </w:tbl>
     <w:p>
-      <w:pPr>
-        <w:spacing w:after="120"/>
-      </w:pPr>
+      <w:r>
+        <w:t>**Discussion:** While Xception collapses to near-random guess (**51.18% AUC** overall and **44.42% on SD Text2Img**) due to dataset-specific shortcut memorization, Proposed Model maintains **+5.76% higher overall AUC** and **62.42% AUC on InsightFace**, proving superior cross-domain generalization against unseen AI Diffusion generators.</w:t>
+      </w:r>
     </w:p>
     <w:p>
-      <w:pPr>
-        <w:spacing w:after="80" w:line="276" w:lineRule="auto"/>
-      </w:pPr>
       <w:r>
-        <w:t>Discussion: While Xception collapses to near-random guess (51.18% AUC overall and 44.42% on SD Text2Img) due to dataset-specific shortcut memorization, Fusion v4 maintains +5.76% higher overall AUC and 62.42% AUC on InsightFace, proving superior cross-domain generalization against unseen AI Diffusion generators.</w:t>
+        <w:t>*Fig. 2. Zero-Shot Cross-Domain Generalization AUC comparing Xception Baseline, SBI Baseline, and Proposed Model across FF++ Methods and DFF Generative Diffusion Models.*</w:t>
+      </w:r>
+    </w:p>
+    <w:p>
+      <w:r>
+        <w:t>---</w:t>
       </w:r>
     </w:p>
     <w:p>
       <w:pPr>
-        <w:spacing w:after="120"/>
-      </w:pPr>
-    </w:p>
-    <w:p>
-      <w:pPr>
-        <w:pStyle w:val="Heading2"/>
-        <w:spacing w:before="200" w:after="80"/>
-        <w:jc w:val="left"/>
+        <w:pStyle w:val="Heading1"/>
       </w:pPr>
       <w:r>
         <w:t>V. Spatial Explainability &amp; Grad-CAM Visualization</w:t>
       </w:r>
     </w:p>
     <w:p>
-      <w:pPr>
-        <w:spacing w:after="80" w:line="276" w:lineRule="auto"/>
-      </w:pPr>
       <w:r>
         <w:t>Our model's auxiliary localization head provides quantitative and qualitative spatial explainability:</w:t>
       </w:r>
@@ -2736,39 +545,37 @@
     <w:p>
       <w:pPr>
         <w:pStyle w:val="ListBullet"/>
-        <w:spacing w:after="40"/>
       </w:pPr>
       <w:r>
-        <w:t>Pointing Game Accuracy (88.84%): In 88.84% of fake test images, the peak activation pixel falls directly inside the ground-truth manipulated mask.</w:t>
+        <w:t>**Pointing Game Accuracy (88.84%):** In 88.84% of fake test images, the peak activation pixel falls directly inside the ground-truth manipulated mask.</w:t>
       </w:r>
     </w:p>
     <w:p>
       <w:pPr>
         <w:pStyle w:val="ListBullet"/>
-        <w:spacing w:after="40"/>
       </w:pPr>
       <w:r>
-        <w:t>Adaptive Mask IoU (57.84% @ 0.05): Achieves 57.84% spatial overlap with ground-truth manipulation boundaries.</w:t>
+        <w:t>**Adaptive Mask IoU (57.84% @ 0.05):** Achieves 57.84% spatial overlap with ground-truth manipulation boundaries.</w:t>
+      </w:r>
+    </w:p>
+    <w:p>
+      <w:r>
+        <w:t>*Fig. 3. Master Grad-CAM &amp; Spatial Forgery Localization Showcase displaying 3 Authentic Real Face Samples (Top) and 3 Manipulated Fake Face Samples (Bottom).*</w:t>
+      </w:r>
+    </w:p>
+    <w:p>
+      <w:r>
+        <w:t>*Fig. 4. Horizontal Comparative Grad-CAM Showcase Grid contrasting Proposed Model Spatial Heatmaps against Xception Baseline Grad-CAM activations.*</w:t>
+      </w:r>
+    </w:p>
+    <w:p>
+      <w:r>
+        <w:t>---</w:t>
       </w:r>
     </w:p>
     <w:p>
       <w:pPr>
-        <w:spacing w:after="80" w:line="276" w:lineRule="auto"/>
-      </w:pPr>
-      <w:r>
-        <w:t>Executable via scripts/09_generate_gradcam.py, our visualization suite generates 3-panel figure grids displaying Input Face Crop + Prediction Label &amp; Confidence Rate (%), Ground-Truth Manipulation Mask, and Model Heatmap Overlay, giving complete qualitative proof for review.</w:t>
-      </w:r>
-    </w:p>
-    <w:p>
-      <w:pPr>
-        <w:spacing w:after="120"/>
-      </w:pPr>
-    </w:p>
-    <w:p>
-      <w:pPr>
-        <w:pStyle w:val="Heading2"/>
-        <w:spacing w:before="200" w:after="80"/>
-        <w:jc w:val="left"/>
+        <w:pStyle w:val="Heading1"/>
       </w:pPr>
       <w:r>
         <w:t>VI. Comprehensive Ablation Study &amp; Robustness Analysis</w:t>
@@ -2776,8 +583,7 @@
     </w:p>
     <w:p>
       <w:pPr>
-        <w:pStyle w:val="Heading3"/>
-        <w:jc w:val="left"/>
+        <w:pStyle w:val="Heading2"/>
       </w:pPr>
       <w:r>
         <w:t>A. Experiment 1: Impact of Frequency Stream Backbone</w:t>
@@ -2786,245 +592,19 @@
     <w:p>
       <w:pPr>
         <w:pStyle w:val="Heading3"/>
-        <w:jc w:val="left"/>
       </w:pPr>
       <w:r>
         <w:t>TABLE V: Ablation Study 1 — Frequency Backbone Impact</w:t>
       </w:r>
     </w:p>
-    <w:tbl>
-      <w:tblPr>
-        <w:tblW w:type="auto" w:w="0"/>
-        <w:jc w:val="center"/>
-        <w:tblLook w:firstColumn="1" w:firstRow="1" w:lastColumn="0" w:lastRow="0" w:noHBand="0" w:noVBand="1" w:val="04A0"/>
-      </w:tblPr>
-      <w:tblGrid>
-        <w:gridCol w:w="1560"/>
-        <w:gridCol w:w="1560"/>
-        <w:gridCol w:w="1560"/>
-        <w:gridCol w:w="1560"/>
-        <w:gridCol w:w="1560"/>
-        <w:gridCol w:w="1560"/>
-      </w:tblGrid>
-      <w:tr>
-        <w:tc>
-          <w:tcPr>
-            <w:tcW w:type="dxa" w:w="1560"/>
-          </w:tcPr>
-          <w:p>
-            <w:r>
-              <w:rPr>
-                <w:b/>
-              </w:rPr>
-              <w:t>Model Variant</w:t>
-            </w:r>
-          </w:p>
-        </w:tc>
-        <w:tc>
-          <w:tcPr>
-            <w:tcW w:type="dxa" w:w="1560"/>
-          </w:tcPr>
-          <w:p>
-            <w:r>
-              <w:rPr>
-                <w:b/>
-              </w:rPr>
-              <w:t>Frequency Backbone</w:t>
-            </w:r>
-          </w:p>
-        </w:tc>
-        <w:tc>
-          <w:tcPr>
-            <w:tcW w:type="dxa" w:w="1560"/>
-          </w:tcPr>
-          <w:p>
-            <w:r>
-              <w:rPr>
-                <w:b/>
-              </w:rPr>
-              <w:t>In-Dataset AUC</w:t>
-            </w:r>
-          </w:p>
-        </w:tc>
-        <w:tc>
-          <w:tcPr>
-            <w:tcW w:type="dxa" w:w="1560"/>
-          </w:tcPr>
-          <w:p>
-            <w:r>
-              <w:rPr>
-                <w:b/>
-              </w:rPr>
-              <w:t>Pointing Game Acc</w:t>
-            </w:r>
-          </w:p>
-        </w:tc>
-        <w:tc>
-          <w:tcPr>
-            <w:tcW w:type="dxa" w:w="1560"/>
-          </w:tcPr>
-          <w:p>
-            <w:r>
-              <w:rPr>
-                <w:b/>
-              </w:rPr>
-              <w:t>Best Mask IoU</w:t>
-            </w:r>
-          </w:p>
-        </w:tc>
-        <w:tc>
-          <w:tcPr>
-            <w:tcW w:type="dxa" w:w="1560"/>
-          </w:tcPr>
-          <w:p>
-            <w:r>
-              <w:rPr>
-                <w:b/>
-              </w:rPr>
-              <w:t>Net Contribution</w:t>
-            </w:r>
-          </w:p>
-        </w:tc>
-      </w:tr>
-      <w:tr>
-        <w:tc>
-          <w:tcPr>
-            <w:tcW w:type="dxa" w:w="1560"/>
-          </w:tcPr>
-          <w:p>
-            <w:r>
-              <w:t>Fusion v3</w:t>
-            </w:r>
-          </w:p>
-        </w:tc>
-        <w:tc>
-          <w:tcPr>
-            <w:tcW w:type="dxa" w:w="1560"/>
-          </w:tcPr>
-          <w:p>
-            <w:r>
-              <w:t>Simple 3-Layer CNN</w:t>
-            </w:r>
-          </w:p>
-        </w:tc>
-        <w:tc>
-          <w:tcPr>
-            <w:tcW w:type="dxa" w:w="1560"/>
-          </w:tcPr>
-          <w:p>
-            <w:r>
-              <w:t>87.85%</w:t>
-            </w:r>
-          </w:p>
-        </w:tc>
-        <w:tc>
-          <w:tcPr>
-            <w:tcW w:type="dxa" w:w="1560"/>
-          </w:tcPr>
-          <w:p>
-            <w:r>
-              <w:t>75.55%</w:t>
-            </w:r>
-          </w:p>
-        </w:tc>
-        <w:tc>
-          <w:tcPr>
-            <w:tcW w:type="dxa" w:w="1560"/>
-          </w:tcPr>
-          <w:p>
-            <w:r>
-              <w:t>41.76%</w:t>
-            </w:r>
-          </w:p>
-        </w:tc>
-        <w:tc>
-          <w:tcPr>
-            <w:tcW w:type="dxa" w:w="1560"/>
-          </w:tcPr>
-          <w:p>
-            <w:r>
-              <w:t>Baseline dual-stream configuration.</w:t>
-            </w:r>
-          </w:p>
-        </w:tc>
-      </w:tr>
-      <w:tr>
-        <w:tc>
-          <w:tcPr>
-            <w:tcW w:type="dxa" w:w="1560"/>
-          </w:tcPr>
-          <w:p>
-            <w:r>
-              <w:t>Fusion v4 (Full)</w:t>
-            </w:r>
-          </w:p>
-        </w:tc>
-        <w:tc>
-          <w:tcPr>
-            <w:tcW w:type="dxa" w:w="1560"/>
-          </w:tcPr>
-          <w:p>
-            <w:r>
-              <w:t>EfficientNet-B0</w:t>
-            </w:r>
-          </w:p>
-        </w:tc>
-        <w:tc>
-          <w:tcPr>
-            <w:tcW w:type="dxa" w:w="1560"/>
-          </w:tcPr>
-          <w:p>
-            <w:r>
-              <w:t>91.07% 🔥</w:t>
-            </w:r>
-          </w:p>
-        </w:tc>
-        <w:tc>
-          <w:tcPr>
-            <w:tcW w:type="dxa" w:w="1560"/>
-          </w:tcPr>
-          <w:p>
-            <w:r>
-              <w:t>88.84% 🚀</w:t>
-            </w:r>
-          </w:p>
-        </w:tc>
-        <w:tc>
-          <w:tcPr>
-            <w:tcW w:type="dxa" w:w="1560"/>
-          </w:tcPr>
-          <w:p>
-            <w:r>
-              <w:t>57.84% 🎯</w:t>
-            </w:r>
-          </w:p>
-        </w:tc>
-        <w:tc>
-          <w:tcPr>
-            <w:tcW w:type="dxa" w:w="1560"/>
-          </w:tcPr>
-          <w:p>
-            <w:r>
-              <w:t>+3.22% AUC, +13.29% Pointing Game, +16.08% Mask IoU</w:t>
-            </w:r>
-          </w:p>
-        </w:tc>
-      </w:tr>
-    </w:tbl>
     <w:p>
-      <w:pPr>
-        <w:spacing w:after="120"/>
-      </w:pPr>
+      <w:r>
+        <w:t>---</w:t>
+      </w:r>
     </w:p>
     <w:p>
       <w:pPr>
-        <w:spacing w:after="120"/>
-      </w:pPr>
-    </w:p>
-    <w:p>
-      <w:pPr>
-        <w:pStyle w:val="Heading3"/>
-        <w:jc w:val="left"/>
+        <w:pStyle w:val="Heading2"/>
       </w:pPr>
       <w:r>
         <w:t>B. Experiment 2: Dual-Stream Fusion vs. Single Stream Models</w:t>
@@ -3033,848 +613,55 @@
     <w:p>
       <w:pPr>
         <w:pStyle w:val="Heading3"/>
-        <w:jc w:val="left"/>
       </w:pPr>
       <w:r>
         <w:t>TABLE VI: Ablation Study 2 — Dual-Stream Fusion Impact</w:t>
       </w:r>
     </w:p>
-    <w:tbl>
-      <w:tblPr>
-        <w:tblW w:type="auto" w:w="0"/>
-        <w:jc w:val="center"/>
-        <w:tblLook w:firstColumn="1" w:firstRow="1" w:lastColumn="0" w:lastRow="0" w:noHBand="0" w:noVBand="1" w:val="04A0"/>
-      </w:tblPr>
-      <w:tblGrid>
-        <w:gridCol w:w="1872"/>
-        <w:gridCol w:w="1872"/>
-        <w:gridCol w:w="1872"/>
-        <w:gridCol w:w="1872"/>
-        <w:gridCol w:w="1872"/>
-      </w:tblGrid>
-      <w:tr>
-        <w:tc>
-          <w:tcPr>
-            <w:tcW w:type="dxa" w:w="1872"/>
-          </w:tcPr>
-          <w:p>
-            <w:r>
-              <w:rPr>
-                <w:b/>
-              </w:rPr>
-              <w:t>Model Variant</w:t>
-            </w:r>
-          </w:p>
-        </w:tc>
-        <w:tc>
-          <w:tcPr>
-            <w:tcW w:type="dxa" w:w="1872"/>
-          </w:tcPr>
-          <w:p>
-            <w:r>
-              <w:rPr>
-                <w:b/>
-              </w:rPr>
-              <w:t>Stream 1 (CLIP Semantics)</w:t>
-            </w:r>
-          </w:p>
-        </w:tc>
-        <w:tc>
-          <w:tcPr>
-            <w:tcW w:type="dxa" w:w="1872"/>
-          </w:tcPr>
-          <w:p>
-            <w:r>
-              <w:rPr>
-                <w:b/>
-              </w:rPr>
-              <w:t>Stream 2 (SRM Frequency)</w:t>
-            </w:r>
-          </w:p>
-        </w:tc>
-        <w:tc>
-          <w:tcPr>
-            <w:tcW w:type="dxa" w:w="1872"/>
-          </w:tcPr>
-          <w:p>
-            <w:r>
-              <w:rPr>
-                <w:b/>
-              </w:rPr>
-              <w:t>FF++ Test AUC</w:t>
-            </w:r>
-          </w:p>
-        </w:tc>
-        <w:tc>
-          <w:tcPr>
-            <w:tcW w:type="dxa" w:w="1872"/>
-          </w:tcPr>
-          <w:p>
-            <w:r>
-              <w:rPr>
-                <w:b/>
-              </w:rPr>
-              <w:t>DFF Cross-Domain AUC</w:t>
-            </w:r>
-          </w:p>
-        </w:tc>
-      </w:tr>
-      <w:tr>
-        <w:tc>
-          <w:tcPr>
-            <w:tcW w:type="dxa" w:w="1872"/>
-          </w:tcPr>
-          <w:p>
-            <w:r>
-              <w:t>Stream 1 Only</w:t>
-            </w:r>
-          </w:p>
-        </w:tc>
-        <w:tc>
-          <w:tcPr>
-            <w:tcW w:type="dxa" w:w="1872"/>
-          </w:tcPr>
-          <w:p>
-            <w:r>
-              <w:t>Yes</w:t>
-            </w:r>
-          </w:p>
-        </w:tc>
-        <w:tc>
-          <w:tcPr>
-            <w:tcW w:type="dxa" w:w="1872"/>
-          </w:tcPr>
-          <w:p>
-            <w:r>
-              <w:t>❌ No</w:t>
-            </w:r>
-          </w:p>
-        </w:tc>
-        <w:tc>
-          <w:tcPr>
-            <w:tcW w:type="dxa" w:w="1872"/>
-          </w:tcPr>
-          <w:p>
-            <w:r>
-              <w:t>84.10%</w:t>
-            </w:r>
-          </w:p>
-        </w:tc>
-        <w:tc>
-          <w:tcPr>
-            <w:tcW w:type="dxa" w:w="1872"/>
-          </w:tcPr>
-          <w:p>
-            <w:r>
-              <w:t>53.20%</w:t>
-            </w:r>
-          </w:p>
-        </w:tc>
-      </w:tr>
-      <w:tr>
-        <w:tc>
-          <w:tcPr>
-            <w:tcW w:type="dxa" w:w="1872"/>
-          </w:tcPr>
-          <w:p>
-            <w:r>
-              <w:t>Stream 2 Only</w:t>
-            </w:r>
-          </w:p>
-        </w:tc>
-        <w:tc>
-          <w:tcPr>
-            <w:tcW w:type="dxa" w:w="1872"/>
-          </w:tcPr>
-          <w:p>
-            <w:r>
-              <w:t>❌ No</w:t>
-            </w:r>
-          </w:p>
-        </w:tc>
-        <w:tc>
-          <w:tcPr>
-            <w:tcW w:type="dxa" w:w="1872"/>
-          </w:tcPr>
-          <w:p>
-            <w:r>
-              <w:t>Yes</w:t>
-            </w:r>
-          </w:p>
-        </w:tc>
-        <w:tc>
-          <w:tcPr>
-            <w:tcW w:type="dxa" w:w="1872"/>
-          </w:tcPr>
-          <w:p>
-            <w:r>
-              <w:t>78.50%</w:t>
-            </w:r>
-          </w:p>
-        </w:tc>
-        <w:tc>
-          <w:tcPr>
-            <w:tcW w:type="dxa" w:w="1872"/>
-          </w:tcPr>
-          <w:p>
-            <w:r>
-              <w:t>49.80%</w:t>
-            </w:r>
-          </w:p>
-        </w:tc>
-      </w:tr>
-      <w:tr>
-        <w:tc>
-          <w:tcPr>
-            <w:tcW w:type="dxa" w:w="1872"/>
-          </w:tcPr>
-          <w:p>
-            <w:r>
-              <w:t>Fusion v4 (Full)</w:t>
-            </w:r>
-          </w:p>
-        </w:tc>
-        <w:tc>
-          <w:tcPr>
-            <w:tcW w:type="dxa" w:w="1872"/>
-          </w:tcPr>
-          <w:p>
-            <w:r>
-              <w:t>Yes</w:t>
-            </w:r>
-          </w:p>
-        </w:tc>
-        <w:tc>
-          <w:tcPr>
-            <w:tcW w:type="dxa" w:w="1872"/>
-          </w:tcPr>
-          <w:p>
-            <w:r>
-              <w:t>Yes</w:t>
-            </w:r>
-          </w:p>
-        </w:tc>
-        <w:tc>
-          <w:tcPr>
-            <w:tcW w:type="dxa" w:w="1872"/>
-          </w:tcPr>
-          <w:p>
-            <w:r>
-              <w:t>91.07%</w:t>
-            </w:r>
-          </w:p>
-        </w:tc>
-        <w:tc>
-          <w:tcPr>
-            <w:tcW w:type="dxa" w:w="1872"/>
-          </w:tcPr>
-          <w:p>
-            <w:r>
-              <w:t>56.94%</w:t>
-            </w:r>
-          </w:p>
-        </w:tc>
-      </w:tr>
-    </w:tbl>
     <w:p>
-      <w:pPr>
-        <w:spacing w:after="120"/>
-      </w:pPr>
+      <w:r>
+        <w:t>---</w:t>
+      </w:r>
     </w:p>
     <w:p>
       <w:pPr>
-        <w:spacing w:after="120"/>
-      </w:pPr>
-    </w:p>
-    <w:p>
-      <w:pPr>
-        <w:pStyle w:val="Heading3"/>
-        <w:jc w:val="left"/>
+        <w:pStyle w:val="Heading2"/>
       </w:pPr>
       <w:r>
         <w:t>C. Experiment 3: Image &amp; Video Compression Robustness Benchmark</w:t>
       </w:r>
     </w:p>
     <w:p>
-      <w:pPr>
-        <w:spacing w:after="80" w:line="276" w:lineRule="auto"/>
-      </w:pPr>
       <w:r>
-        <w:t>To measure resilience against social media re-encoding (JPEG/H.264 compression), we evaluated both models across controlled JPEG quality factor degradation levels $Q \in [100, 90, 80, 70, 60, 50]$ on 22,397 test frames using scripts/10_evaluate_compression_robustness.py.</w:t>
+        <w:t>To measure resilience against social media re-encoding (JPEG/H.264 compression), we evaluated both models across controlled JPEG quality factor degradation levels $Q \in [100, 90, 80, 70, 60, 50]$ on 22,397 test frames using `scripts/10_evaluate_compression_robustness.py`.</w:t>
       </w:r>
     </w:p>
     <w:p>
       <w:pPr>
         <w:pStyle w:val="Heading3"/>
-        <w:jc w:val="left"/>
       </w:pPr>
       <w:r>
         <w:t>TABLE VII: Controlled Compression Degradation Benchmark (JPEG Q=100 down to Q=50)</w:t>
       </w:r>
     </w:p>
-    <w:tbl>
-      <w:tblPr>
-        <w:tblW w:type="auto" w:w="0"/>
-        <w:jc w:val="center"/>
-        <w:tblLook w:firstColumn="1" w:firstRow="1" w:lastColumn="0" w:lastRow="0" w:noHBand="0" w:noVBand="1" w:val="04A0"/>
-      </w:tblPr>
-      <w:tblGrid>
-        <w:gridCol w:w="1337"/>
-        <w:gridCol w:w="1337"/>
-        <w:gridCol w:w="1337"/>
-        <w:gridCol w:w="1337"/>
-        <w:gridCol w:w="1337"/>
-        <w:gridCol w:w="1337"/>
-        <w:gridCol w:w="1337"/>
-      </w:tblGrid>
-      <w:tr>
-        <w:tc>
-          <w:tcPr>
-            <w:tcW w:type="dxa" w:w="1337"/>
-          </w:tcPr>
-          <w:p>
-            <w:r>
-              <w:rPr>
-                <w:b/>
-              </w:rPr>
-              <w:t>JPEG Quality Factor ($Q$)</w:t>
-            </w:r>
-          </w:p>
-        </w:tc>
-        <w:tc>
-          <w:tcPr>
-            <w:tcW w:type="dxa" w:w="1337"/>
-          </w:tcPr>
-          <w:p>
-            <w:r>
-              <w:rPr>
-                <w:b/>
-              </w:rPr>
-              <w:t>Compression Level</w:t>
-            </w:r>
-          </w:p>
-        </w:tc>
-        <w:tc>
-          <w:tcPr>
-            <w:tcW w:type="dxa" w:w="1337"/>
-          </w:tcPr>
-          <w:p>
-            <w:r>
-              <w:rPr>
-                <w:b/>
-              </w:rPr>
-              <w:t>Premier Fusion Model v4 AUC</w:t>
-            </w:r>
-          </w:p>
-        </w:tc>
-        <w:tc>
-          <w:tcPr>
-            <w:tcW w:type="dxa" w:w="1337"/>
-          </w:tcPr>
-          <w:p>
-            <w:r>
-              <w:rPr>
-                <w:b/>
-              </w:rPr>
-              <w:t>Fusion v4 AP</w:t>
-            </w:r>
-          </w:p>
-        </w:tc>
-        <w:tc>
-          <w:tcPr>
-            <w:tcW w:type="dxa" w:w="1337"/>
-          </w:tcPr>
-          <w:p>
-            <w:r>
-              <w:rPr>
-                <w:b/>
-              </w:rPr>
-              <w:t>Xception Baseline AUC</w:t>
-            </w:r>
-          </w:p>
-        </w:tc>
-        <w:tc>
-          <w:tcPr>
-            <w:tcW w:type="dxa" w:w="1337"/>
-          </w:tcPr>
-          <w:p>
-            <w:r>
-              <w:rPr>
-                <w:b/>
-              </w:rPr>
-              <w:t>Xception AP</w:t>
-            </w:r>
-          </w:p>
-        </w:tc>
-        <w:tc>
-          <w:tcPr>
-            <w:tcW w:type="dxa" w:w="1337"/>
-          </w:tcPr>
-          <w:p>
-            <w:r>
-              <w:rPr>
-                <w:b/>
-              </w:rPr>
-              <w:t>Fusion Stability</w:t>
-            </w:r>
-          </w:p>
-        </w:tc>
-      </w:tr>
-      <w:tr>
-        <w:tc>
-          <w:tcPr>
-            <w:tcW w:type="dxa" w:w="1337"/>
-          </w:tcPr>
-          <w:p>
-            <w:r>
-              <w:t>$Q = 100$</w:t>
-            </w:r>
-          </w:p>
-        </w:tc>
-        <w:tc>
-          <w:tcPr>
-            <w:tcW w:type="dxa" w:w="1337"/>
-          </w:tcPr>
-          <w:p>
-            <w:r>
-              <w:t>Clean / Uncompressed</w:t>
-            </w:r>
-          </w:p>
-        </w:tc>
-        <w:tc>
-          <w:tcPr>
-            <w:tcW w:type="dxa" w:w="1337"/>
-          </w:tcPr>
-          <w:p>
-            <w:r>
-              <w:t>90.28%</w:t>
-            </w:r>
-          </w:p>
-        </w:tc>
-        <w:tc>
-          <w:tcPr>
-            <w:tcW w:type="dxa" w:w="1337"/>
-          </w:tcPr>
-          <w:p>
-            <w:r>
-              <w:t>97.32%</w:t>
-            </w:r>
-          </w:p>
-        </w:tc>
-        <w:tc>
-          <w:tcPr>
-            <w:tcW w:type="dxa" w:w="1337"/>
-          </w:tcPr>
-          <w:p>
-            <w:r>
-              <w:t>98.33%</w:t>
-            </w:r>
-          </w:p>
-        </w:tc>
-        <w:tc>
-          <w:tcPr>
-            <w:tcW w:type="dxa" w:w="1337"/>
-          </w:tcPr>
-          <w:p>
-            <w:r>
-              <w:t>99.60%</w:t>
-            </w:r>
-          </w:p>
-        </w:tc>
-        <w:tc>
-          <w:tcPr>
-            <w:tcW w:type="dxa" w:w="1337"/>
-          </w:tcPr>
-          <w:p>
-            <w:r>
-              <w:t>Baseline</w:t>
-            </w:r>
-          </w:p>
-        </w:tc>
-      </w:tr>
-      <w:tr>
-        <w:tc>
-          <w:tcPr>
-            <w:tcW w:type="dxa" w:w="1337"/>
-          </w:tcPr>
-          <w:p>
-            <w:r>
-              <w:t>$Q = 90$</w:t>
-            </w:r>
-          </w:p>
-        </w:tc>
-        <w:tc>
-          <w:tcPr>
-            <w:tcW w:type="dxa" w:w="1337"/>
-          </w:tcPr>
-          <w:p>
-            <w:r>
-              <w:t>Light Social Media</w:t>
-            </w:r>
-          </w:p>
-        </w:tc>
-        <w:tc>
-          <w:tcPr>
-            <w:tcW w:type="dxa" w:w="1337"/>
-          </w:tcPr>
-          <w:p>
-            <w:r>
-              <w:t>90.27%</w:t>
-            </w:r>
-          </w:p>
-        </w:tc>
-        <w:tc>
-          <w:tcPr>
-            <w:tcW w:type="dxa" w:w="1337"/>
-          </w:tcPr>
-          <w:p>
-            <w:r>
-              <w:t>97.32%</w:t>
-            </w:r>
-          </w:p>
-        </w:tc>
-        <w:tc>
-          <w:tcPr>
-            <w:tcW w:type="dxa" w:w="1337"/>
-          </w:tcPr>
-          <w:p>
-            <w:r>
-              <w:t>98.33%</w:t>
-            </w:r>
-          </w:p>
-        </w:tc>
-        <w:tc>
-          <w:tcPr>
-            <w:tcW w:type="dxa" w:w="1337"/>
-          </w:tcPr>
-          <w:p>
-            <w:r>
-              <w:t>99.60%</w:t>
-            </w:r>
-          </w:p>
-        </w:tc>
-        <w:tc>
-          <w:tcPr>
-            <w:tcW w:type="dxa" w:w="1337"/>
-          </w:tcPr>
-          <w:p>
-            <w:r>
-              <w:t>-0.01%</w:t>
-            </w:r>
-          </w:p>
-        </w:tc>
-      </w:tr>
-      <w:tr>
-        <w:tc>
-          <w:tcPr>
-            <w:tcW w:type="dxa" w:w="1337"/>
-          </w:tcPr>
-          <w:p>
-            <w:r>
-              <w:t>$Q = 80$</w:t>
-            </w:r>
-          </w:p>
-        </w:tc>
-        <w:tc>
-          <w:tcPr>
-            <w:tcW w:type="dxa" w:w="1337"/>
-          </w:tcPr>
-          <w:p>
-            <w:r>
-              <w:t>Standard Web Re-encode</w:t>
-            </w:r>
-          </w:p>
-        </w:tc>
-        <w:tc>
-          <w:tcPr>
-            <w:tcW w:type="dxa" w:w="1337"/>
-          </w:tcPr>
-          <w:p>
-            <w:r>
-              <w:t>90.30%</w:t>
-            </w:r>
-          </w:p>
-        </w:tc>
-        <w:tc>
-          <w:tcPr>
-            <w:tcW w:type="dxa" w:w="1337"/>
-          </w:tcPr>
-          <w:p>
-            <w:r>
-              <w:t>97.32%</w:t>
-            </w:r>
-          </w:p>
-        </w:tc>
-        <w:tc>
-          <w:tcPr>
-            <w:tcW w:type="dxa" w:w="1337"/>
-          </w:tcPr>
-          <w:p>
-            <w:r>
-              <w:t>98.33%</w:t>
-            </w:r>
-          </w:p>
-        </w:tc>
-        <w:tc>
-          <w:tcPr>
-            <w:tcW w:type="dxa" w:w="1337"/>
-          </w:tcPr>
-          <w:p>
-            <w:r>
-              <w:t>99.60%</w:t>
-            </w:r>
-          </w:p>
-        </w:tc>
-        <w:tc>
-          <w:tcPr>
-            <w:tcW w:type="dxa" w:w="1337"/>
-          </w:tcPr>
-          <w:p>
-            <w:r>
-              <w:t>+0.02%</w:t>
-            </w:r>
-          </w:p>
-        </w:tc>
-      </w:tr>
-      <w:tr>
-        <w:tc>
-          <w:tcPr>
-            <w:tcW w:type="dxa" w:w="1337"/>
-          </w:tcPr>
-          <w:p>
-            <w:r>
-              <w:t>$Q = 70$</w:t>
-            </w:r>
-          </w:p>
-        </w:tc>
-        <w:tc>
-          <w:tcPr>
-            <w:tcW w:type="dxa" w:w="1337"/>
-          </w:tcPr>
-          <w:p>
-            <w:r>
-              <w:t>Medium WhatsApp / Twitter</w:t>
-            </w:r>
-          </w:p>
-        </w:tc>
-        <w:tc>
-          <w:tcPr>
-            <w:tcW w:type="dxa" w:w="1337"/>
-          </w:tcPr>
-          <w:p>
-            <w:r>
-              <w:t>90.29%</w:t>
-            </w:r>
-          </w:p>
-        </w:tc>
-        <w:tc>
-          <w:tcPr>
-            <w:tcW w:type="dxa" w:w="1337"/>
-          </w:tcPr>
-          <w:p>
-            <w:r>
-              <w:t>97.33%</w:t>
-            </w:r>
-          </w:p>
-        </w:tc>
-        <w:tc>
-          <w:tcPr>
-            <w:tcW w:type="dxa" w:w="1337"/>
-          </w:tcPr>
-          <w:p>
-            <w:r>
-              <w:t>98.32%</w:t>
-            </w:r>
-          </w:p>
-        </w:tc>
-        <w:tc>
-          <w:tcPr>
-            <w:tcW w:type="dxa" w:w="1337"/>
-          </w:tcPr>
-          <w:p>
-            <w:r>
-              <w:t>99.60%</w:t>
-            </w:r>
-          </w:p>
-        </w:tc>
-        <w:tc>
-          <w:tcPr>
-            <w:tcW w:type="dxa" w:w="1337"/>
-          </w:tcPr>
-          <w:p>
-            <w:r>
-              <w:t>+0.01%</w:t>
-            </w:r>
-          </w:p>
-        </w:tc>
-      </w:tr>
-      <w:tr>
-        <w:tc>
-          <w:tcPr>
-            <w:tcW w:type="dxa" w:w="1337"/>
-          </w:tcPr>
-          <w:p>
-            <w:r>
-              <w:t>$Q = 60$</w:t>
-            </w:r>
-          </w:p>
-        </w:tc>
-        <w:tc>
-          <w:tcPr>
-            <w:tcW w:type="dxa" w:w="1337"/>
-          </w:tcPr>
-          <w:p>
-            <w:r>
-              <w:t>Heavy Compression</w:t>
-            </w:r>
-          </w:p>
-        </w:tc>
-        <w:tc>
-          <w:tcPr>
-            <w:tcW w:type="dxa" w:w="1337"/>
-          </w:tcPr>
-          <w:p>
-            <w:r>
-              <w:t>90.26%</w:t>
-            </w:r>
-          </w:p>
-        </w:tc>
-        <w:tc>
-          <w:tcPr>
-            <w:tcW w:type="dxa" w:w="1337"/>
-          </w:tcPr>
-          <w:p>
-            <w:r>
-              <w:t>97.32%</w:t>
-            </w:r>
-          </w:p>
-        </w:tc>
-        <w:tc>
-          <w:tcPr>
-            <w:tcW w:type="dxa" w:w="1337"/>
-          </w:tcPr>
-          <w:p>
-            <w:r>
-              <w:t>98.33%</w:t>
-            </w:r>
-          </w:p>
-        </w:tc>
-        <w:tc>
-          <w:tcPr>
-            <w:tcW w:type="dxa" w:w="1337"/>
-          </w:tcPr>
-          <w:p>
-            <w:r>
-              <w:t>99.60%</w:t>
-            </w:r>
-          </w:p>
-        </w:tc>
-        <w:tc>
-          <w:tcPr>
-            <w:tcW w:type="dxa" w:w="1337"/>
-          </w:tcPr>
-          <w:p>
-            <w:r>
-              <w:t>-0.02%</w:t>
-            </w:r>
-          </w:p>
-        </w:tc>
-      </w:tr>
-      <w:tr>
-        <w:tc>
-          <w:tcPr>
-            <w:tcW w:type="dxa" w:w="1337"/>
-          </w:tcPr>
-          <w:p>
-            <w:r>
-              <w:t>$Q = 50$</w:t>
-            </w:r>
-          </w:p>
-        </w:tc>
-        <w:tc>
-          <w:tcPr>
-            <w:tcW w:type="dxa" w:w="1337"/>
-          </w:tcPr>
-          <w:p>
-            <w:r>
-              <w:t>Severe Compression</w:t>
-            </w:r>
-          </w:p>
-        </w:tc>
-        <w:tc>
-          <w:tcPr>
-            <w:tcW w:type="dxa" w:w="1337"/>
-          </w:tcPr>
-          <w:p>
-            <w:r>
-              <w:t>90.26%</w:t>
-            </w:r>
-          </w:p>
-        </w:tc>
-        <w:tc>
-          <w:tcPr>
-            <w:tcW w:type="dxa" w:w="1337"/>
-          </w:tcPr>
-          <w:p>
-            <w:r>
-              <w:t>97.32%</w:t>
-            </w:r>
-          </w:p>
-        </w:tc>
-        <w:tc>
-          <w:tcPr>
-            <w:tcW w:type="dxa" w:w="1337"/>
-          </w:tcPr>
-          <w:p>
-            <w:r>
-              <w:t>98.32%</w:t>
-            </w:r>
-          </w:p>
-        </w:tc>
-        <w:tc>
-          <w:tcPr>
-            <w:tcW w:type="dxa" w:w="1337"/>
-          </w:tcPr>
-          <w:p>
-            <w:r>
-              <w:t>99.60%</w:t>
-            </w:r>
-          </w:p>
-        </w:tc>
-        <w:tc>
-          <w:tcPr>
-            <w:tcW w:type="dxa" w:w="1337"/>
-          </w:tcPr>
-          <w:p>
-            <w:r>
-              <w:t>-0.02%</w:t>
-            </w:r>
-          </w:p>
-        </w:tc>
-      </w:tr>
-    </w:tbl>
     <w:p>
-      <w:pPr>
-        <w:spacing w:after="120"/>
-      </w:pPr>
+      <w:r>
+        <w:t>*Fig. 5. Controlled JPEG Compression Degradation Curves ($Q=100 \to Q=50$) across both FaceForensics++ (Panel a) and DeepFakeFace (Panel b).*</w:t>
+      </w:r>
     </w:p>
     <w:p>
-      <w:pPr>
-        <w:spacing w:after="80" w:line="276" w:lineRule="auto"/>
-      </w:pPr>
       <w:r>
-        <w:t>Discussion: The empirical results in Table VII demonstrate that Fusion Model v4 experiences virtually zero degradation (-0.02% maximum AUC change) even under severe JPEG compression ($Q=50$). This confirms that our Compression Gating network $g(X)$ dynamically balances frequency representations while Stream 1's CLIP semantic visual features provide an unshakeable baseline immune to block compression artifacts.</w:t>
+        <w:t>**Discussion:** The empirical results demonstrate that **Proposed Model experiences virtually zero degradation (-0.02% maximum AUC change)** even under severe JPEG compression ($Q=50$). This confirms that our **Compression Gating network $g(X)$** dynamically balances frequency representations while **Stream 1's CLIP semantic visual features** provide an unshakeable baseline immune to block compression artifacts.</w:t>
+      </w:r>
+    </w:p>
+    <w:p>
+      <w:r>
+        <w:t>---</w:t>
       </w:r>
     </w:p>
     <w:p>
       <w:pPr>
-        <w:spacing w:after="120"/>
-      </w:pPr>
-    </w:p>
-    <w:p>
-      <w:pPr>
-        <w:pStyle w:val="Heading3"/>
-        <w:jc w:val="left"/>
+        <w:pStyle w:val="Heading2"/>
       </w:pPr>
       <w:r>
         <w:t>D. Computational Efficiency &amp; Parameter Analysis</w:t>
@@ -3883,183 +670,131 @@
     <w:p>
       <w:pPr>
         <w:pStyle w:val="ListBullet"/>
-        <w:spacing w:after="40"/>
       </w:pPr>
       <w:r>
-        <w:t>Total Parameter Count: 91,754,135 (91.7M)</w:t>
+        <w:t>**Total Parameter Count:** 91,754,135 (91.7M)</w:t>
       </w:r>
     </w:p>
     <w:p>
       <w:pPr>
         <w:pStyle w:val="ListBullet"/>
-        <w:spacing w:after="40"/>
       </w:pPr>
       <w:r>
-        <w:t>Trainable Parameter Count: 18,475,415 (18.5M - 20.1%)</w:t>
+        <w:t>**Trainable Parameter Count:** 18,475,415 (18.5M - 20.1%)</w:t>
       </w:r>
     </w:p>
     <w:p>
       <w:pPr>
         <w:pStyle w:val="ListBullet"/>
-        <w:spacing w:after="40"/>
       </w:pPr>
       <w:r>
-        <w:t>Inference Latency: ~2.8 ms per frame on NVIDIA A100 GPU (~350 FPS real-time throughput).</w:t>
+        <w:t>**Inference Latency:** **~2.8 ms per frame** on NVIDIA A100 GPU (**~350 FPS real-time throughput**).</w:t>
+      </w:r>
+    </w:p>
+    <w:p>
+      <w:r>
+        <w:t>---</w:t>
       </w:r>
     </w:p>
     <w:p>
       <w:pPr>
-        <w:spacing w:after="120"/>
-      </w:pPr>
-    </w:p>
-    <w:p>
-      <w:pPr>
-        <w:pStyle w:val="Heading2"/>
-        <w:spacing w:before="200" w:after="80"/>
-        <w:jc w:val="left"/>
+        <w:pStyle w:val="Heading1"/>
       </w:pPr>
       <w:r>
         <w:t>VII. Conclusion &amp; Future Work</w:t>
       </w:r>
     </w:p>
     <w:p>
-      <w:pPr>
-        <w:spacing w:after="80" w:line="276" w:lineRule="auto"/>
-      </w:pPr>
       <w:r>
-        <w:t>In this paper, we introduced a Novel Dual-Stream Semantic-Frequency Fusion Network (Fusion v4) combining CLIP ViT-B/32 visual semantics with SRM + EfficientNet-B0 noise features. Evaluated on FaceForensics++ C23, our architecture achieves 91.07% Test AUC, 88.84% Pointing Game Accuracy, and 57.84% Mask IoU. Zero-shot cross-domain evaluation on the DeepFakeFace dataset proves that our model significantly outperforms standard Xception baselines on modern Diffusion Model fakes (+5.76% overall AUC, +8.08% SD Text2Img AUC). Furthermore, compression robustness tests confirm near-zero performance loss (-0.02% AUC drop) down to $Q=50$.</w:t>
+        <w:t>In this paper, we introduced a **Novel Dual-Stream Semantic-Frequency Fusion Network (Proposed Model)** combining CLIP ViT-B/32 visual semantics with SRM + EfficientNet-B0 noise features. Evaluated on FaceForensics++ C23, our architecture achieves **91.07% Test AUC**, **88.84% Pointing Game Accuracy**, and **57.84% Mask IoU**. Zero-shot cross-domain evaluation on the DeepFakeFace dataset proves that our model significantly outperforms standard Xception baselines on modern Diffusion Model fakes (**+5.76% overall AUC**, **+8.08% SD Text2Img AUC**). Furthermore, compression robustness tests confirm near-zero performance loss (**-0.02% AUC drop**) down to $Q=50$.</w:t>
       </w:r>
     </w:p>
     <w:p>
-      <w:pPr>
-        <w:spacing w:after="80" w:line="276" w:lineRule="auto"/>
-      </w:pPr>
       <w:r>
         <w:t>Future work will explore multi-frame temporal attention modules and video-level clip aggregation for real-time video stream detection.</w:t>
       </w:r>
     </w:p>
     <w:p>
-      <w:pPr>
-        <w:spacing w:after="120"/>
-      </w:pPr>
+      <w:r>
+        <w:t>---</w:t>
+      </w:r>
     </w:p>
     <w:p>
       <w:pPr>
-        <w:pStyle w:val="Heading2"/>
-        <w:spacing w:before="200" w:after="80"/>
-        <w:jc w:val="left"/>
+        <w:pStyle w:val="Heading1"/>
       </w:pPr>
       <w:r>
         <w:t>References</w:t>
       </w:r>
     </w:p>
     <w:p>
-      <w:pPr>
-        <w:spacing w:after="80" w:line="276" w:lineRule="auto"/>
-      </w:pPr>
       <w:r>
-        <w:t>1. A. Rössler et al., "FaceForensics++: Learning to detect manipulated facial images," in IEEE/CVF Int. Conf. Comput. Vis. (ICCV), 2019, pp. 1-11.</w:t>
+        <w:t>1. A. Rössler et al., "FaceForensics++: Learning to detect manipulated facial images," in *IEEE/CVF Int. Conf. Comput. Vis. (ICCV)*, 2019, pp. 1-11.</w:t>
       </w:r>
     </w:p>
     <w:p>
-      <w:pPr>
-        <w:spacing w:after="80" w:line="276" w:lineRule="auto"/>
-      </w:pPr>
       <w:r>
-        <w:t>2. Y. Li et al., "Face X-ray for more general face forgery detection," in IEEE/CVF Conf. Comput. Vis. Pattern Recognit. (CVPR), 2020, pp. 5001-5010.</w:t>
+        <w:t>2. Y. Li et al., "Face X-ray for more general face forgery detection," in *IEEE/CVF Conf. Comput. Vis. Pattern Recognit. (CVPR)*, 2020, pp. 5001-5010.</w:t>
       </w:r>
     </w:p>
     <w:p>
-      <w:pPr>
-        <w:spacing w:after="80" w:line="276" w:lineRule="auto"/>
-      </w:pPr>
       <w:r>
-        <w:t>3. H. Zhao et al., "Multi-attentional deepfake detection," in IEEE/CVF Conf. Comput. Vis. Pattern Recognit. (CVPR), 2021, pp. 2185-2194.</w:t>
+        <w:t>3. H. Zhao et al., "Multi-attentional deepfake detection," in *IEEE/CVF Conf. Comput. Vis. Pattern Recognit. (CVPR)*, 2021, pp. 2185-2194.</w:t>
       </w:r>
     </w:p>
     <w:p>
-      <w:pPr>
-        <w:spacing w:after="80" w:line="276" w:lineRule="auto"/>
-      </w:pPr>
       <w:r>
-        <w:t>4. Y. Li et al., "Pairwise self-consistency learning for face forgery detection," in IEEE/CVF Conf. Comput. Vis. Pattern Recognit. (CVPR), 2021, pp. 1-10.</w:t>
+        <w:t>4. Y. Li et al., "Pairwise self-consistency learning for face forgery detection," in *IEEE/CVF Conf. Comput. Vis. Pattern Recognit. (CVPR)*, 2021, pp. 1-10.</w:t>
       </w:r>
     </w:p>
     <w:p>
-      <w:pPr>
-        <w:spacing w:after="80" w:line="276" w:lineRule="auto"/>
-      </w:pPr>
       <w:r>
-        <w:t>5. Y. Luo et al., "Generalizing face forgery detection with high-frequency features," in IEEE/CVF Conf. Comput. Vis. Pattern Recognit. (CVPR), 2021, pp. 10817-10826.</w:t>
+        <w:t>5. Y. Luo et al., "Generalizing face forgery detection with high-frequency features," in *IEEE/CVF Conf. Comput. Vis. Pattern Recognit. (CVPR)*, 2021, pp. 10817-10826.</w:t>
       </w:r>
     </w:p>
     <w:p>
-      <w:pPr>
-        <w:spacing w:after="80" w:line="276" w:lineRule="auto"/>
-      </w:pPr>
       <w:r>
-        <w:t>6. K. Shiohara and T. YamasakiLB, "Detecting deepfakes by creating synthetic images," in IEEE/CVF Conf. Comput. Vis. Pattern Recognit. (CVPR), 2022, pp. 1-10.</w:t>
+        <w:t>6. K. Shiohara and T. YamasakiLB, "Detecting deepfakes by creating synthetic images," in *IEEE/CVF Conf. Comput. Vis. Pattern Recognit. (CVPR)*, 2022, pp. 1-10.</w:t>
       </w:r>
     </w:p>
     <w:p>
-      <w:pPr>
-        <w:spacing w:after="80" w:line="276" w:lineRule="auto"/>
-      </w:pPr>
       <w:r>
-        <w:t>7. L. Chen et al., "Self-supervised learning of adversarial example generation for deepfake detection," in IEEE/CVF Conf. Comput. Vis. Pattern Recognit. (CVPR), 2022.</w:t>
+        <w:t>7. L. Chen et al., "Self-supervised learning of adversarial example generation for deepfake detection," in *IEEE/CVF Conf. Comput. Vis. Pattern Recognit. (CVPR)*, 2022.</w:t>
       </w:r>
     </w:p>
     <w:p>
-      <w:pPr>
-        <w:spacing w:after="80" w:line="276" w:lineRule="auto"/>
-      </w:pPr>
       <w:r>
-        <w:t>8. W. Zhuang et al., "UIA-ViT: Unsupervised implicit attention vision transformer for face forgery detection," in Eur. Conf. Comput. Vis. (ECCV), 2022.</w:t>
+        <w:t>8. W. Zhuang et al., "UIA-ViT: Unsupervised implicit attention vision transformer for face forgery detection," in *Eur. Conf. Comput. Vis. (ECCV)*, 2022.</w:t>
       </w:r>
     </w:p>
     <w:p>
-      <w:pPr>
-        <w:spacing w:after="80" w:line="276" w:lineRule="auto"/>
-      </w:pPr>
       <w:r>
-        <w:t>9. Z. Wang et al., "AltFreezing for more general video face forgery detection," in IEEE/CVF Conf. Comput. Vis. Pattern Recognit. (CVPR), 2023.</w:t>
+        <w:t>9. Z. Wang et al., "AltFreezing for more general video face forgery detection," in *IEEE/CVF Conf. Comput. Vis. Pattern Recognit. (CVPR)*, 2023.</w:t>
       </w:r>
     </w:p>
     <w:p>
-      <w:pPr>
-        <w:spacing w:after="80" w:line="276" w:lineRule="auto"/>
-      </w:pPr>
       <w:r>
-        <w:t>10. Y. Xu et al., "TALL: Thumbnail layout for deepfake video detection," in IEEE/CVF Conf. Comput. Vis. Pattern Recognit. (CVPR), 2023.</w:t>
+        <w:t>10. Y. Xu et al., "TALL: Thumbnail layout for deepfake video detection," in *IEEE/CVF Conf. Comput. Vis. Pattern Recognit. (CVPR)*, 2023.</w:t>
       </w:r>
     </w:p>
     <w:p>
-      <w:pPr>
-        <w:spacing w:after="80" w:line="276" w:lineRule="auto"/>
-      </w:pPr>
       <w:r>
-        <w:t>11. N. Dong et al., "Implicit identity leakage in deepfake detectors," in IEEE/CVF Conf. Comput. Vis. Pattern Recognit. (CVPR), 2023.</w:t>
+        <w:t>11. N. Dong et al., "Implicit identity leakage in deepfake detectors," in *IEEE/CVF Conf. Comput. Vis. Pattern Recognit. (CVPR)*, 2023.</w:t>
       </w:r>
     </w:p>
     <w:p>
-      <w:pPr>
-        <w:spacing w:after="80" w:line="276" w:lineRule="auto"/>
-      </w:pPr>
       <w:r>
-        <w:t>12. X. Yan et al., "UCF: Uncovering common features for generalizable deepfake detection," in IEEE/CVF Conf. Comput. Vis. Pattern Recognit. (CVPR), 2023.</w:t>
+        <w:t>12. X. Yan et al., "UCF: Uncovering common features for generalizable deepfake detection," in *IEEE/CVF Conf. Comput. Vis. Pattern Recognit. (CVPR)*, 2023.</w:t>
       </w:r>
     </w:p>
     <w:p>
-      <w:pPr>
-        <w:spacing w:after="80" w:line="276" w:lineRule="auto"/>
-      </w:pPr>
       <w:r>
-        <w:t>13. H. Song, S. Huang, Y. Dong, and W.-W. Tu, "Robustness and generalizability of deepfake detection: A study with diffusion models," arXiv preprint arXiv:2309.00000, 2023.</w:t>
+        <w:t>13. H. Song, S. Huang, Y. Dong, and W.-W. Tu, "Robustness and generalizability of deepfake detection: A study with diffusion models," *arXiv preprint arXiv:2309.00000*, 2023.</w:t>
       </w:r>
     </w:p>
     <w:sectPr>
       <w:pgSz w:w="12240" w:h="15840"/>
-      <w:pgMar w:top="1440" w:right="1440" w:bottom="1440" w:left="1440" w:header="720" w:footer="720" w:gutter="0"/>
+      <w:pgMar w:top="1440" w:right="1800" w:bottom="1440" w:left="1800" w:header="720" w:footer="720" w:gutter="0"/>
       <w:cols w:space="720"/>
       <w:docGrid w:linePitch="360"/>
     </w:sectPr>

</xml_diff>

<commit_message>
docs: update official author details (Shashank Singh, Deepinder Kaur), department (CSE AI), and university (KIET Deemed to be University) across all paper formats
</commit_message>
<xml_diff>
--- a/paper_draft.docx
+++ b/paper_draft.docx
@@ -12,12 +12,16 @@
     </w:p>
     <w:p>
       <w:r>
-        <w:t>Shashank Singh Singhania — Department of Computer Science &amp; Engineering — July 2026</w:t>
+        <w:rPr>
+          <w:b/>
+        </w:rPr>
+        <w:t>Shashank Singh and Deepinder Kaur</w:t>
+        <w:br/>
       </w:r>
-    </w:p>
-    <w:p>
       <w:r>
-        <w:t>Department of Computer Science &amp; Engineering</w:t>
+        <w:t>Department of Computer Science &amp; Engineering (Artificial Intelligence)</w:t>
+        <w:br/>
+        <w:t>KIET Deemed to be University, Ghaziabad, India — July 2026</w:t>
       </w:r>
     </w:p>
     <w:p>

</xml_diff>

<commit_message>
docs: update Acknowledgment section crediting KIET Center of Excellence - Supercomputing Lab's NVIDIA DGX A100 Supercomputer
</commit_message>
<xml_diff>
--- a/paper_draft.docx
+++ b/paper_draft.docx
@@ -22,6 +22,11 @@
         <w:t>Department of Computer Science &amp; Engineering (Artificial Intelligence)</w:t>
         <w:br/>
         <w:t>KIET Deemed to be University, Ghaziabad, India — July 2026</w:t>
+      </w:r>
+    </w:p>
+    <w:p>
+      <w:r>
+        <w:t>KIET Deemed to be University, Ghaziabad, India</w:t>
       </w:r>
     </w:p>
     <w:p>
@@ -714,8 +719,16 @@
       </w:r>
     </w:p>
     <w:p>
+      <w:pPr>
+        <w:pStyle w:val="Heading1"/>
+      </w:pPr>
       <w:r>
-        <w:t>Future work will explore multi-frame temporal attention modules and video-level clip aggregation for real-time video stream detection.</w:t>
+        <w:t>Acknowledgment</w:t>
+      </w:r>
+    </w:p>
+    <w:p>
+      <w:r>
+        <w:t>The authors express their sincere gratitude to **KIET Deemed to be University** and the **Department of Computer Science &amp; Engineering (Artificial Intelligence)** for providing academic research support. The authors specifically acknowledge the high-performance computing infrastructure and technical facilities provided by the **Center of Excellence - Supercomputing Lab's NVIDIA DGX A100 Supercomputer**, which enabled the empirical training, evaluation, and visualization experiments conducted in this research.</w:t>
       </w:r>
     </w:p>
     <w:p>

</xml_diff>

<commit_message>
docs: remove redundant Figure 7 compression degradation graph (retaining Table IV / Table VII rendered image for clean tabular presentation)
</commit_message>
<xml_diff>
--- a/paper_draft.docx
+++ b/paper_draft.docx
@@ -655,11 +655,6 @@
     </w:p>
     <w:p>
       <w:r>
-        <w:t>*Fig. 5. Controlled JPEG Compression Degradation Curves ($Q=100 \to Q=50$) across both FaceForensics++ (Panel a) and DeepFakeFace (Panel b).*</w:t>
-      </w:r>
-    </w:p>
-    <w:p>
-      <w:r>
         <w:t>**Discussion:** The empirical results demonstrate that **Proposed Model experiences virtually zero degradation (-0.02% maximum AUC change)** even under severe JPEG compression ($Q=50$). This confirms that our **Compression Gating network $g(X)$** dynamically balances frequency representations while **Stream 1's CLIP semantic visual features** provide an unshakeable baseline immune to block compression artifacts.</w:t>
       </w:r>
     </w:p>

</xml_diff>